<commit_message>
chore(report): refresh phase 1 final evidence
</commit_message>
<xml_diff>
--- a/docs/reports/phase-1-ai-editor-shell/phase-1-ai-editor-shell-report.docx
+++ b/docs/reports/phase-1-ai-editor-shell/phase-1-ai-editor-shell-report.docx
@@ -4,23 +4,33 @@
   <w:body>
     <w:p>
       <w:pPr>
-        <w:spacing w:after="60"/>
+        <w:jc w:val="center"/>
       </w:pPr>
       <w:r>
         <w:rPr>
+          <w:rFonts w:ascii="Arial" w:hAnsi="Arial"/>
           <w:b/>
-          <w:color w:val="1F4D78"/>
-          <w:sz w:val="44"/>
+          <w:color w:val="1C415B"/>
+          <w:sz w:val="40"/>
         </w:rPr>
         <w:t>Strut Phase 1 AI Editor Shell Report</w:t>
       </w:r>
     </w:p>
     <w:p>
       <w:pPr>
-        <w:spacing w:after="240"/>
+        <w:jc w:val="center"/>
       </w:pPr>
       <w:r>
-        <w:t>AI Editor Shell And Design System | 2026-06-05</w:t>
+        <w:rPr>
+          <w:color w:val="586269"/>
+          <w:sz w:val="18"/>
+        </w:rPr>
+        <w:t>AI Editor Shell And Design System | Final evidence refresh | 2026-06-07</w:t>
+      </w:r>
+    </w:p>
+    <w:p>
+      <w:r>
+        <w:t>Phase 1 is now documented through the final UI fixes bfe03ca and a38c354. This report is scoped to Phase 1 only: no Phase 2 selection hit-testing, operation patches, dynamic generation planning engine, or agentic CLI mode were implemented.</w:t>
       </w:r>
     </w:p>
     <w:p>
@@ -32,192 +42,76 @@
       </w:r>
     </w:p>
     <w:p>
+      <w:pPr>
+        <w:pStyle w:val="ListBullet"/>
+      </w:pPr>
       <w:r>
-        <w:t>Phase 1 replaced the scattered studio surface with a coherent AI edit-mode shell while keeping generation behavior intact. The new first viewport now has a top project/status bar, left AI edit rail, right preview workspace, stable empty/generated preview states, selection-aware placeholder affordances, and a consistent design system across light and dark modes.</w:t>
+        <w:t>Built a coherent AI editor shell with chat/edit rail, preview workspace, top project/status bar, provider visibility, and selection-aware placeholders.</w:t>
       </w:r>
     </w:p>
-    <w:tbl>
-      <w:tblPr>
-        <w:tblStyle w:val="TableGrid"/>
-        <w:tblW w:type="auto" w:w="0"/>
-        <w:jc w:val="center"/>
-        <w:tblLook w:firstColumn="1" w:firstRow="1" w:lastColumn="0" w:lastRow="0" w:noHBand="0" w:noVBand="1" w:val="04A0"/>
-      </w:tblPr>
-      <w:tblGrid>
-        <w:gridCol w:w="4680"/>
-        <w:gridCol w:w="4680"/>
-      </w:tblGrid>
-      <w:tr>
-        <w:tc>
-          <w:tcPr>
-            <w:tcW w:type="dxa" w:w="2376"/>
-            <w:shd w:fill="F2F4F7"/>
-          </w:tcPr>
-          <w:p>
-            <w:r/>
-            <w:r>
-              <w:rPr>
-                <w:b/>
-                <w:sz w:val="18"/>
-              </w:rPr>
-              <w:t>Area</w:t>
-            </w:r>
-          </w:p>
-        </w:tc>
-        <w:tc>
-          <w:tcPr>
-            <w:tcW w:type="dxa" w:w="6984"/>
-            <w:shd w:fill="F2F4F7"/>
-          </w:tcPr>
-          <w:p>
-            <w:r/>
-            <w:r>
-              <w:rPr>
-                <w:b/>
-                <w:sz w:val="18"/>
-              </w:rPr>
-              <w:t>Result</w:t>
-            </w:r>
-          </w:p>
-        </w:tc>
-      </w:tr>
-      <w:tr>
-        <w:tc>
-          <w:tcPr>
-            <w:tcW w:type="dxa" w:w="2376"/>
-            <w:vAlign w:val="top"/>
-          </w:tcPr>
-          <w:p>
-            <w:r/>
-            <w:r>
-              <w:rPr>
-                <w:b w:val="0"/>
-                <w:sz w:val="18"/>
-              </w:rPr>
-              <w:t>Scope boundary</w:t>
-            </w:r>
-          </w:p>
-        </w:tc>
-        <w:tc>
-          <w:tcPr>
-            <w:tcW w:type="dxa" w:w="6984"/>
-            <w:vAlign w:val="top"/>
-          </w:tcPr>
-          <w:p>
-            <w:r/>
-            <w:r>
-              <w:rPr>
-                <w:b w:val="0"/>
-                <w:sz w:val="18"/>
-              </w:rPr>
-              <w:t>Phase 1 only. No dynamic generation planning engine, no agentic CLI mode, no fixed mascot/pet atlas.</w:t>
-            </w:r>
-          </w:p>
-        </w:tc>
-      </w:tr>
-      <w:tr>
-        <w:tc>
-          <w:tcPr>
-            <w:tcW w:type="dxa" w:w="2376"/>
-            <w:vAlign w:val="top"/>
-          </w:tcPr>
-          <w:p>
-            <w:r/>
-            <w:r>
-              <w:rPr>
-                <w:b w:val="0"/>
-                <w:sz w:val="18"/>
-              </w:rPr>
-              <w:t>Core UI</w:t>
-            </w:r>
-          </w:p>
-        </w:tc>
-        <w:tc>
-          <w:tcPr>
-            <w:tcW w:type="dxa" w:w="6984"/>
-            <w:vAlign w:val="top"/>
-          </w:tcPr>
-          <w:p>
-            <w:r/>
-            <w:r>
-              <w:rPr>
-                <w:b w:val="0"/>
-                <w:sz w:val="18"/>
-              </w:rPr>
-              <w:t>Left AI edit rail, right live preview workspace, top project/status bar, inspector, stable empty/generated states.</w:t>
-            </w:r>
-          </w:p>
-        </w:tc>
-      </w:tr>
-      <w:tr>
-        <w:tc>
-          <w:tcPr>
-            <w:tcW w:type="dxa" w:w="2376"/>
-            <w:vAlign w:val="top"/>
-          </w:tcPr>
-          <w:p>
-            <w:r/>
-            <w:r>
-              <w:rPr>
-                <w:b w:val="0"/>
-                <w:sz w:val="18"/>
-              </w:rPr>
-              <w:t>Design system</w:t>
-            </w:r>
-          </w:p>
-        </w:tc>
-        <w:tc>
-          <w:tcPr>
-            <w:tcW w:type="dxa" w:w="6984"/>
-            <w:vAlign w:val="top"/>
-          </w:tcPr>
-          <w:p>
-            <w:r/>
-            <w:r>
-              <w:rPr>
-                <w:b w:val="0"/>
-                <w:sz w:val="18"/>
-              </w:rPr>
-              <w:t>Off-white pastel light surfaces with muted mint accents; blackish/dark-grey dark mode with dark navy accents.</w:t>
-            </w:r>
-          </w:p>
-        </w:tc>
-      </w:tr>
-      <w:tr>
-        <w:tc>
-          <w:tcPr>
-            <w:tcW w:type="dxa" w:w="2376"/>
-            <w:vAlign w:val="top"/>
-          </w:tcPr>
-          <w:p>
-            <w:r/>
-            <w:r>
-              <w:rPr>
-                <w:b w:val="0"/>
-                <w:sz w:val="18"/>
-              </w:rPr>
-              <w:t>Generation behavior</w:t>
-            </w:r>
-          </w:p>
-        </w:tc>
-        <w:tc>
-          <w:tcPr>
-            <w:tcW w:type="dxa" w:w="6984"/>
-            <w:vAlign w:val="top"/>
-          </w:tcPr>
-          <w:p>
-            <w:r/>
-            <w:r>
-              <w:rPr>
-                <w:b w:val="0"/>
-                <w:sz w:val="18"/>
-              </w:rPr>
-              <w:t>Preserved existing generation/provider behavior; backend engine was not expanded in this phase.</w:t>
-            </w:r>
-          </w:p>
-        </w:tc>
-      </w:tr>
-    </w:tbl>
+    <w:p>
+      <w:pPr>
+        <w:pStyle w:val="ListBullet"/>
+      </w:pPr>
+      <w:r>
+        <w:t>Refreshed official after screenshots from current HEAD after the later UI readability fixes.</w:t>
+      </w:r>
+    </w:p>
+    <w:p>
+      <w:pPr>
+        <w:pStyle w:val="ListBullet"/>
+      </w:pPr>
+      <w:r>
+        <w:t>Recreated the DOCX report and documented rendered-proof handling in rendered/README.md.</w:t>
+      </w:r>
+    </w:p>
+    <w:p>
+      <w:pPr>
+        <w:pStyle w:val="ListBullet"/>
+      </w:pPr>
+      <w:r>
+        <w:t>Preserved unrelated dirty docs/Tauri worktree files without reverting or committing them.</w:t>
+      </w:r>
+    </w:p>
+    <w:p>
+      <w:pPr>
+        <w:pStyle w:val="Heading1"/>
+      </w:pPr>
+      <w:r>
+        <w:t>Dirty Worktree Recorded Before Final Fix Pass</w:t>
+      </w:r>
+    </w:p>
+    <w:p>
+      <w:pPr>
+        <w:spacing w:after="160"/>
+        <w:ind w:left="216"/>
+      </w:pPr>
+      <w:r>
+        <w:rPr>
+          <w:rFonts w:ascii="Consolas" w:hAnsi="Consolas"/>
+          <w:sz w:val="16"/>
+        </w:rPr>
+        <w:t>## codex/phase-1-ai-editor-shell</w:t>
+        <w:br/>
+        <w:t xml:space="preserve"> M README.md</w:t>
+        <w:br/>
+        <w:t xml:space="preserve"> M apps/studio/src-tauri/src/lib.rs</w:t>
+        <w:br/>
+        <w:t xml:space="preserve"> M docs/README.md</w:t>
+        <w:br/>
+        <w:t xml:space="preserve"> M docs/guides/generate-a-character.md</w:t>
+        <w:br/>
+        <w:t xml:space="preserve"> M docs/learn/first-animation.md</w:t>
+        <w:br/>
+        <w:t xml:space="preserve"> M docs/learn/quick-start.md</w:t>
+        <w:br/>
+        <w:t xml:space="preserve"> M docs/learn/what-is-strut.md</w:t>
+        <w:br/>
+        <w:t>?? docs/learn/motion-language.md</w:t>
+        <w:br/>
+        <w:t>?? docs/superpowers/</w:t>
+      </w:r>
+    </w:p>
     <w:p>
       <w:pPr>
         <w:pStyle w:val="Heading1"/>
@@ -231,7 +125,7 @@
         <w:pStyle w:val="ListBullet"/>
       </w:pPr>
       <w:r>
-        <w:t>Built an AI edit-mode shell with a left rail and right preview workspace.</w:t>
+        <w:t>AI edit shell with left rail, right preview workspace, top status bar, stable empty/generated preview states, project files, and scene layers.</w:t>
       </w:r>
     </w:p>
     <w:p>
@@ -239,7 +133,7 @@
         <w:pStyle w:val="ListBullet"/>
       </w:pPr>
       <w:r>
-        <w:t>Added selected target label, selection outline placeholder, ask-AI-to-edit-selection placeholder, and disabled apply/reject operation controls.</w:t>
+        <w:t>Selection-aware placeholders: selected target label, visual outline placeholder, ask-AI-to-edit-selection control, and disabled apply/reject operation area.</w:t>
       </w:r>
     </w:p>
     <w:p>
@@ -247,7 +141,7 @@
         <w:pStyle w:val="ListBullet"/>
       </w:pPr>
       <w:r>
-        <w:t>Standardized app chrome tokens, typography, spacing, borders, focus states, preview surface, and panel surfaces.</w:t>
+        <w:t>Theme tokens for off-white/mint light mode and blackish/navy dark mode with consistent app chrome independent of generated scene colors.</w:t>
       </w:r>
     </w:p>
     <w:p>
@@ -255,648 +149,23 @@
         <w:pStyle w:val="ListBullet"/>
       </w:pPr>
       <w:r>
-        <w:t>Added focused smoke coverage for the AI editor shell and selection-aware placeholders.</w:t>
+        <w:t>User chat bubbles and direct rendered markdown assistant/system responses.</w:t>
       </w:r>
     </w:p>
     <w:p>
       <w:pPr>
-        <w:pStyle w:val="Heading1"/>
+        <w:pStyle w:val="ListBullet"/>
       </w:pPr>
       <w:r>
-        <w:t>Before And After Visual Evidence</w:t>
-      </w:r>
-    </w:p>
-    <w:p>
-      <w:r>
-        <w:t>Representative Browser screenshots are embedded below. The full screenshot inventory is saved under the report screenshots folder.</w:t>
+        <w:t>Visible provider selection in provider page, top chrome, composer, settings, activity, and assistant response text.</w:t>
       </w:r>
     </w:p>
     <w:p>
       <w:pPr>
-        <w:pStyle w:val="Heading2"/>
+        <w:pStyle w:val="ListBullet"/>
       </w:pPr>
       <w:r>
-        <w:t>Main workspace light</w:t>
-      </w:r>
-    </w:p>
-    <w:p>
-      <w:r>
-        <w:t>Before</w:t>
-      </w:r>
-    </w:p>
-    <w:p>
-      <w:pPr>
-        <w:jc w:val="center"/>
-      </w:pPr>
-      <w:r>
-        <w:drawing>
-          <wp:inline xmlns:a="http://schemas.openxmlformats.org/drawingml/2006/main" xmlns:pic="http://schemas.openxmlformats.org/drawingml/2006/picture">
-            <wp:extent cx="2926080" cy="1910080"/>
-            <wp:docPr id="1" name="Picture 1"/>
-            <wp:cNvGraphicFramePr>
-              <a:graphicFrameLocks noChangeAspect="1"/>
-            </wp:cNvGraphicFramePr>
-            <a:graphic>
-              <a:graphicData uri="http://schemas.openxmlformats.org/drawingml/2006/picture">
-                <pic:pic>
-                  <pic:nvPicPr>
-                    <pic:cNvPr id="0" name="before-01-main-workspace-light.png"/>
-                    <pic:cNvPicPr/>
-                  </pic:nvPicPr>
-                  <pic:blipFill>
-                    <a:blip r:embed="rId9"/>
-                    <a:stretch>
-                      <a:fillRect/>
-                    </a:stretch>
-                  </pic:blipFill>
-                  <pic:spPr>
-                    <a:xfrm>
-                      <a:off x="0" y="0"/>
-                      <a:ext cx="2926080" cy="1910080"/>
-                    </a:xfrm>
-                    <a:prstGeom prst="rect"/>
-                  </pic:spPr>
-                </pic:pic>
-              </a:graphicData>
-            </a:graphic>
-          </wp:inline>
-        </w:drawing>
-      </w:r>
-    </w:p>
-    <w:p>
-      <w:r>
-        <w:t>After</w:t>
-      </w:r>
-    </w:p>
-    <w:p>
-      <w:pPr>
-        <w:jc w:val="center"/>
-      </w:pPr>
-      <w:r>
-        <w:drawing>
-          <wp:inline xmlns:a="http://schemas.openxmlformats.org/drawingml/2006/main" xmlns:pic="http://schemas.openxmlformats.org/drawingml/2006/picture">
-            <wp:extent cx="2926080" cy="1910080"/>
-            <wp:docPr id="2" name="Picture 2"/>
-            <wp:cNvGraphicFramePr>
-              <a:graphicFrameLocks noChangeAspect="1"/>
-            </wp:cNvGraphicFramePr>
-            <a:graphic>
-              <a:graphicData uri="http://schemas.openxmlformats.org/drawingml/2006/picture">
-                <pic:pic>
-                  <pic:nvPicPr>
-                    <pic:cNvPr id="0" name="after-01-main-workspace-light.png"/>
-                    <pic:cNvPicPr/>
-                  </pic:nvPicPr>
-                  <pic:blipFill>
-                    <a:blip r:embed="rId10"/>
-                    <a:stretch>
-                      <a:fillRect/>
-                    </a:stretch>
-                  </pic:blipFill>
-                  <pic:spPr>
-                    <a:xfrm>
-                      <a:off x="0" y="0"/>
-                      <a:ext cx="2926080" cy="1910080"/>
-                    </a:xfrm>
-                    <a:prstGeom prst="rect"/>
-                  </pic:spPr>
-                </pic:pic>
-              </a:graphicData>
-            </a:graphic>
-          </wp:inline>
-        </w:drawing>
-      </w:r>
-    </w:p>
-    <w:p>
-      <w:pPr>
-        <w:pStyle w:val="Heading2"/>
-      </w:pPr>
-      <w:r>
-        <w:t>Empty preview light</w:t>
-      </w:r>
-    </w:p>
-    <w:p>
-      <w:r>
-        <w:t>Before</w:t>
-      </w:r>
-    </w:p>
-    <w:p>
-      <w:pPr>
-        <w:jc w:val="center"/>
-      </w:pPr>
-      <w:r>
-        <w:drawing>
-          <wp:inline xmlns:a="http://schemas.openxmlformats.org/drawingml/2006/main" xmlns:pic="http://schemas.openxmlformats.org/drawingml/2006/picture">
-            <wp:extent cx="2926080" cy="1910080"/>
-            <wp:docPr id="3" name="Picture 3"/>
-            <wp:cNvGraphicFramePr>
-              <a:graphicFrameLocks noChangeAspect="1"/>
-            </wp:cNvGraphicFramePr>
-            <a:graphic>
-              <a:graphicData uri="http://schemas.openxmlformats.org/drawingml/2006/picture">
-                <pic:pic>
-                  <pic:nvPicPr>
-                    <pic:cNvPr id="0" name="before-03-empty-preview-light.png"/>
-                    <pic:cNvPicPr/>
-                  </pic:nvPicPr>
-                  <pic:blipFill>
-                    <a:blip r:embed="rId11"/>
-                    <a:stretch>
-                      <a:fillRect/>
-                    </a:stretch>
-                  </pic:blipFill>
-                  <pic:spPr>
-                    <a:xfrm>
-                      <a:off x="0" y="0"/>
-                      <a:ext cx="2926080" cy="1910080"/>
-                    </a:xfrm>
-                    <a:prstGeom prst="rect"/>
-                  </pic:spPr>
-                </pic:pic>
-              </a:graphicData>
-            </a:graphic>
-          </wp:inline>
-        </w:drawing>
-      </w:r>
-    </w:p>
-    <w:p>
-      <w:r>
-        <w:t>After</w:t>
-      </w:r>
-    </w:p>
-    <w:p>
-      <w:pPr>
-        <w:jc w:val="center"/>
-      </w:pPr>
-      <w:r>
-        <w:drawing>
-          <wp:inline xmlns:a="http://schemas.openxmlformats.org/drawingml/2006/main" xmlns:pic="http://schemas.openxmlformats.org/drawingml/2006/picture">
-            <wp:extent cx="2926080" cy="1910080"/>
-            <wp:docPr id="4" name="Picture 4"/>
-            <wp:cNvGraphicFramePr>
-              <a:graphicFrameLocks noChangeAspect="1"/>
-            </wp:cNvGraphicFramePr>
-            <a:graphic>
-              <a:graphicData uri="http://schemas.openxmlformats.org/drawingml/2006/picture">
-                <pic:pic>
-                  <pic:nvPicPr>
-                    <pic:cNvPr id="0" name="after-03-empty-preview-light.png"/>
-                    <pic:cNvPicPr/>
-                  </pic:nvPicPr>
-                  <pic:blipFill>
-                    <a:blip r:embed="rId12"/>
-                    <a:stretch>
-                      <a:fillRect/>
-                    </a:stretch>
-                  </pic:blipFill>
-                  <pic:spPr>
-                    <a:xfrm>
-                      <a:off x="0" y="0"/>
-                      <a:ext cx="2926080" cy="1910080"/>
-                    </a:xfrm>
-                    <a:prstGeom prst="rect"/>
-                  </pic:spPr>
-                </pic:pic>
-              </a:graphicData>
-            </a:graphic>
-          </wp:inline>
-        </w:drawing>
-      </w:r>
-    </w:p>
-    <w:p>
-      <w:pPr>
-        <w:pStyle w:val="Heading2"/>
-      </w:pPr>
-      <w:r>
-        <w:t>Editor shell light</w:t>
-      </w:r>
-    </w:p>
-    <w:p>
-      <w:r>
-        <w:t>Before</w:t>
-      </w:r>
-    </w:p>
-    <w:p>
-      <w:pPr>
-        <w:jc w:val="center"/>
-      </w:pPr>
-      <w:r>
-        <w:drawing>
-          <wp:inline xmlns:a="http://schemas.openxmlformats.org/drawingml/2006/main" xmlns:pic="http://schemas.openxmlformats.org/drawingml/2006/picture">
-            <wp:extent cx="2926080" cy="1910080"/>
-            <wp:docPr id="5" name="Picture 5"/>
-            <wp:cNvGraphicFramePr>
-              <a:graphicFrameLocks noChangeAspect="1"/>
-            </wp:cNvGraphicFramePr>
-            <a:graphic>
-              <a:graphicData uri="http://schemas.openxmlformats.org/drawingml/2006/picture">
-                <pic:pic>
-                  <pic:nvPicPr>
-                    <pic:cNvPr id="0" name="before-04-editor-surface-light.png"/>
-                    <pic:cNvPicPr/>
-                  </pic:nvPicPr>
-                  <pic:blipFill>
-                    <a:blip r:embed="rId13"/>
-                    <a:stretch>
-                      <a:fillRect/>
-                    </a:stretch>
-                  </pic:blipFill>
-                  <pic:spPr>
-                    <a:xfrm>
-                      <a:off x="0" y="0"/>
-                      <a:ext cx="2926080" cy="1910080"/>
-                    </a:xfrm>
-                    <a:prstGeom prst="rect"/>
-                  </pic:spPr>
-                </pic:pic>
-              </a:graphicData>
-            </a:graphic>
-          </wp:inline>
-        </w:drawing>
-      </w:r>
-    </w:p>
-    <w:p>
-      <w:r>
-        <w:t>After</w:t>
-      </w:r>
-    </w:p>
-    <w:p>
-      <w:pPr>
-        <w:jc w:val="center"/>
-      </w:pPr>
-      <w:r>
-        <w:drawing>
-          <wp:inline xmlns:a="http://schemas.openxmlformats.org/drawingml/2006/main" xmlns:pic="http://schemas.openxmlformats.org/drawingml/2006/picture">
-            <wp:extent cx="2926080" cy="1910080"/>
-            <wp:docPr id="6" name="Picture 6"/>
-            <wp:cNvGraphicFramePr>
-              <a:graphicFrameLocks noChangeAspect="1"/>
-            </wp:cNvGraphicFramePr>
-            <a:graphic>
-              <a:graphicData uri="http://schemas.openxmlformats.org/drawingml/2006/picture">
-                <pic:pic>
-                  <pic:nvPicPr>
-                    <pic:cNvPr id="0" name="after-04-ai-editor-shell-light.png"/>
-                    <pic:cNvPicPr/>
-                  </pic:nvPicPr>
-                  <pic:blipFill>
-                    <a:blip r:embed="rId14"/>
-                    <a:stretch>
-                      <a:fillRect/>
-                    </a:stretch>
-                  </pic:blipFill>
-                  <pic:spPr>
-                    <a:xfrm>
-                      <a:off x="0" y="0"/>
-                      <a:ext cx="2926080" cy="1910080"/>
-                    </a:xfrm>
-                    <a:prstGeom prst="rect"/>
-                  </pic:spPr>
-                </pic:pic>
-              </a:graphicData>
-            </a:graphic>
-          </wp:inline>
-        </w:drawing>
-      </w:r>
-    </w:p>
-    <w:p>
-      <w:pPr>
-        <w:pStyle w:val="Heading2"/>
-      </w:pPr>
-      <w:r>
-        <w:t>Settings light</w:t>
-      </w:r>
-    </w:p>
-    <w:p>
-      <w:r>
-        <w:t>Before</w:t>
-      </w:r>
-    </w:p>
-    <w:p>
-      <w:pPr>
-        <w:jc w:val="center"/>
-      </w:pPr>
-      <w:r>
-        <w:drawing>
-          <wp:inline xmlns:a="http://schemas.openxmlformats.org/drawingml/2006/main" xmlns:pic="http://schemas.openxmlformats.org/drawingml/2006/picture">
-            <wp:extent cx="2926080" cy="1910080"/>
-            <wp:docPr id="7" name="Picture 7"/>
-            <wp:cNvGraphicFramePr>
-              <a:graphicFrameLocks noChangeAspect="1"/>
-            </wp:cNvGraphicFramePr>
-            <a:graphic>
-              <a:graphicData uri="http://schemas.openxmlformats.org/drawingml/2006/picture">
-                <pic:pic>
-                  <pic:nvPicPr>
-                    <pic:cNvPr id="0" name="before-06-settings-page-light.png"/>
-                    <pic:cNvPicPr/>
-                  </pic:nvPicPr>
-                  <pic:blipFill>
-                    <a:blip r:embed="rId15"/>
-                    <a:stretch>
-                      <a:fillRect/>
-                    </a:stretch>
-                  </pic:blipFill>
-                  <pic:spPr>
-                    <a:xfrm>
-                      <a:off x="0" y="0"/>
-                      <a:ext cx="2926080" cy="1910080"/>
-                    </a:xfrm>
-                    <a:prstGeom prst="rect"/>
-                  </pic:spPr>
-                </pic:pic>
-              </a:graphicData>
-            </a:graphic>
-          </wp:inline>
-        </w:drawing>
-      </w:r>
-    </w:p>
-    <w:p>
-      <w:r>
-        <w:t>After</w:t>
-      </w:r>
-    </w:p>
-    <w:p>
-      <w:pPr>
-        <w:jc w:val="center"/>
-      </w:pPr>
-      <w:r>
-        <w:drawing>
-          <wp:inline xmlns:a="http://schemas.openxmlformats.org/drawingml/2006/main" xmlns:pic="http://schemas.openxmlformats.org/drawingml/2006/picture">
-            <wp:extent cx="2926080" cy="1910080"/>
-            <wp:docPr id="8" name="Picture 8"/>
-            <wp:cNvGraphicFramePr>
-              <a:graphicFrameLocks noChangeAspect="1"/>
-            </wp:cNvGraphicFramePr>
-            <a:graphic>
-              <a:graphicData uri="http://schemas.openxmlformats.org/drawingml/2006/picture">
-                <pic:pic>
-                  <pic:nvPicPr>
-                    <pic:cNvPr id="0" name="after-06-settings-page-light.png"/>
-                    <pic:cNvPicPr/>
-                  </pic:nvPicPr>
-                  <pic:blipFill>
-                    <a:blip r:embed="rId16"/>
-                    <a:stretch>
-                      <a:fillRect/>
-                    </a:stretch>
-                  </pic:blipFill>
-                  <pic:spPr>
-                    <a:xfrm>
-                      <a:off x="0" y="0"/>
-                      <a:ext cx="2926080" cy="1910080"/>
-                    </a:xfrm>
-                    <a:prstGeom prst="rect"/>
-                  </pic:spPr>
-                </pic:pic>
-              </a:graphicData>
-            </a:graphic>
-          </wp:inline>
-        </w:drawing>
-      </w:r>
-    </w:p>
-    <w:p>
-      <w:pPr>
-        <w:pStyle w:val="Heading2"/>
-      </w:pPr>
-      <w:r>
-        <w:t>Settings dark</w:t>
-      </w:r>
-    </w:p>
-    <w:p>
-      <w:r>
-        <w:t>Before</w:t>
-      </w:r>
-    </w:p>
-    <w:p>
-      <w:pPr>
-        <w:jc w:val="center"/>
-      </w:pPr>
-      <w:r>
-        <w:drawing>
-          <wp:inline xmlns:a="http://schemas.openxmlformats.org/drawingml/2006/main" xmlns:pic="http://schemas.openxmlformats.org/drawingml/2006/picture">
-            <wp:extent cx="2926080" cy="1910080"/>
-            <wp:docPr id="9" name="Picture 9"/>
-            <wp:cNvGraphicFramePr>
-              <a:graphicFrameLocks noChangeAspect="1"/>
-            </wp:cNvGraphicFramePr>
-            <a:graphic>
-              <a:graphicData uri="http://schemas.openxmlformats.org/drawingml/2006/picture">
-                <pic:pic>
-                  <pic:nvPicPr>
-                    <pic:cNvPr id="0" name="before-07-settings-page-dark.png"/>
-                    <pic:cNvPicPr/>
-                  </pic:nvPicPr>
-                  <pic:blipFill>
-                    <a:blip r:embed="rId17"/>
-                    <a:stretch>
-                      <a:fillRect/>
-                    </a:stretch>
-                  </pic:blipFill>
-                  <pic:spPr>
-                    <a:xfrm>
-                      <a:off x="0" y="0"/>
-                      <a:ext cx="2926080" cy="1910080"/>
-                    </a:xfrm>
-                    <a:prstGeom prst="rect"/>
-                  </pic:spPr>
-                </pic:pic>
-              </a:graphicData>
-            </a:graphic>
-          </wp:inline>
-        </w:drawing>
-      </w:r>
-    </w:p>
-    <w:p>
-      <w:r>
-        <w:t>After</w:t>
-      </w:r>
-    </w:p>
-    <w:p>
-      <w:pPr>
-        <w:jc w:val="center"/>
-      </w:pPr>
-      <w:r>
-        <w:drawing>
-          <wp:inline xmlns:a="http://schemas.openxmlformats.org/drawingml/2006/main" xmlns:pic="http://schemas.openxmlformats.org/drawingml/2006/picture">
-            <wp:extent cx="2926080" cy="1910080"/>
-            <wp:docPr id="10" name="Picture 10"/>
-            <wp:cNvGraphicFramePr>
-              <a:graphicFrameLocks noChangeAspect="1"/>
-            </wp:cNvGraphicFramePr>
-            <a:graphic>
-              <a:graphicData uri="http://schemas.openxmlformats.org/drawingml/2006/picture">
-                <pic:pic>
-                  <pic:nvPicPr>
-                    <pic:cNvPr id="0" name="after-07-settings-page-dark.png"/>
-                    <pic:cNvPicPr/>
-                  </pic:nvPicPr>
-                  <pic:blipFill>
-                    <a:blip r:embed="rId18"/>
-                    <a:stretch>
-                      <a:fillRect/>
-                    </a:stretch>
-                  </pic:blipFill>
-                  <pic:spPr>
-                    <a:xfrm>
-                      <a:off x="0" y="0"/>
-                      <a:ext cx="2926080" cy="1910080"/>
-                    </a:xfrm>
-                    <a:prstGeom prst="rect"/>
-                  </pic:spPr>
-                </pic:pic>
-              </a:graphicData>
-            </a:graphic>
-          </wp:inline>
-        </w:drawing>
-      </w:r>
-    </w:p>
-    <w:p>
-      <w:pPr>
-        <w:pStyle w:val="Heading2"/>
-      </w:pPr>
-      <w:r>
-        <w:t>Narrow editor dark</w:t>
-      </w:r>
-    </w:p>
-    <w:p>
-      <w:r>
-        <w:t>Before</w:t>
-      </w:r>
-    </w:p>
-    <w:p>
-      <w:pPr>
-        <w:jc w:val="center"/>
-      </w:pPr>
-      <w:r>
-        <w:drawing>
-          <wp:inline xmlns:a="http://schemas.openxmlformats.org/drawingml/2006/main" xmlns:pic="http://schemas.openxmlformats.org/drawingml/2006/picture">
-            <wp:extent cx="2926080" cy="2246811"/>
-            <wp:docPr id="11" name="Picture 11"/>
-            <wp:cNvGraphicFramePr>
-              <a:graphicFrameLocks noChangeAspect="1"/>
-            </wp:cNvGraphicFramePr>
-            <a:graphic>
-              <a:graphicData uri="http://schemas.openxmlformats.org/drawingml/2006/picture">
-                <pic:pic>
-                  <pic:nvPicPr>
-                    <pic:cNvPr id="0" name="before-10-narrow-editor-dark.png"/>
-                    <pic:cNvPicPr/>
-                  </pic:nvPicPr>
-                  <pic:blipFill>
-                    <a:blip r:embed="rId19"/>
-                    <a:stretch>
-                      <a:fillRect/>
-                    </a:stretch>
-                  </pic:blipFill>
-                  <pic:spPr>
-                    <a:xfrm>
-                      <a:off x="0" y="0"/>
-                      <a:ext cx="2926080" cy="2246811"/>
-                    </a:xfrm>
-                    <a:prstGeom prst="rect"/>
-                  </pic:spPr>
-                </pic:pic>
-              </a:graphicData>
-            </a:graphic>
-          </wp:inline>
-        </w:drawing>
-      </w:r>
-    </w:p>
-    <w:p>
-      <w:r>
-        <w:t>After</w:t>
-      </w:r>
-    </w:p>
-    <w:p>
-      <w:pPr>
-        <w:jc w:val="center"/>
-      </w:pPr>
-      <w:r>
-        <w:drawing>
-          <wp:inline xmlns:a="http://schemas.openxmlformats.org/drawingml/2006/main" xmlns:pic="http://schemas.openxmlformats.org/drawingml/2006/picture">
-            <wp:extent cx="2926080" cy="6710477"/>
-            <wp:docPr id="12" name="Picture 12"/>
-            <wp:cNvGraphicFramePr>
-              <a:graphicFrameLocks noChangeAspect="1"/>
-            </wp:cNvGraphicFramePr>
-            <a:graphic>
-              <a:graphicData uri="http://schemas.openxmlformats.org/drawingml/2006/picture">
-                <pic:pic>
-                  <pic:nvPicPr>
-                    <pic:cNvPr id="0" name="after-11-narrow-editor-dark.png"/>
-                    <pic:cNvPicPr/>
-                  </pic:nvPicPr>
-                  <pic:blipFill>
-                    <a:blip r:embed="rId20"/>
-                    <a:stretch>
-                      <a:fillRect/>
-                    </a:stretch>
-                  </pic:blipFill>
-                  <pic:spPr>
-                    <a:xfrm>
-                      <a:off x="0" y="0"/>
-                      <a:ext cx="2926080" cy="6710477"/>
-                    </a:xfrm>
-                    <a:prstGeom prst="rect"/>
-                  </pic:spPr>
-                </pic:pic>
-              </a:graphicData>
-            </a:graphic>
-          </wp:inline>
-        </w:drawing>
-      </w:r>
-    </w:p>
-    <w:p>
-      <w:pPr>
-        <w:pStyle w:val="Heading2"/>
-      </w:pPr>
-      <w:r>
-        <w:t>Generated preview proof</w:t>
-      </w:r>
-    </w:p>
-    <w:p>
-      <w:r>
-        <w:t>After</w:t>
-      </w:r>
-    </w:p>
-    <w:p>
-      <w:pPr>
-        <w:jc w:val="center"/>
-      </w:pPr>
-      <w:r>
-        <w:drawing>
-          <wp:inline xmlns:a="http://schemas.openxmlformats.org/drawingml/2006/main" xmlns:pic="http://schemas.openxmlformats.org/drawingml/2006/picture">
-            <wp:extent cx="2926080" cy="1869440"/>
-            <wp:docPr id="13" name="Picture 13"/>
-            <wp:cNvGraphicFramePr>
-              <a:graphicFrameLocks noChangeAspect="1"/>
-            </wp:cNvGraphicFramePr>
-            <a:graphic>
-              <a:graphicData uri="http://schemas.openxmlformats.org/drawingml/2006/picture">
-                <pic:pic>
-                  <pic:nvPicPr>
-                    <pic:cNvPr id="0" name="after-12-generated-preview-smoke.png"/>
-                    <pic:cNvPicPr/>
-                  </pic:nvPicPr>
-                  <pic:blipFill>
-                    <a:blip r:embed="rId21"/>
-                    <a:stretch>
-                      <a:fillRect/>
-                    </a:stretch>
-                  </pic:blipFill>
-                  <pic:spPr>
-                    <a:xfrm>
-                      <a:off x="0" y="0"/>
-                      <a:ext cx="2926080" cy="1869440"/>
-                    </a:xfrm>
-                    <a:prstGeom prst="rect"/>
-                  </pic:spPr>
-                </pic:pic>
-              </a:graphicData>
-            </a:graphic>
-          </wp:inline>
-        </w:drawing>
+        <w:t>Final Codex-like readability pass for chat + preview with wider transcript, narrower preview rail, and reduced visual clutter.</w:t>
       </w:r>
     </w:p>
     <w:p>
@@ -907,162 +176,102 @@
         <w:t>Changed Files</w:t>
       </w:r>
     </w:p>
-    <w:tbl>
-      <w:tblPr>
-        <w:tblStyle w:val="TableGrid"/>
-        <w:tblW w:type="auto" w:w="0"/>
-        <w:jc w:val="center"/>
-        <w:tblLook w:firstColumn="1" w:firstRow="1" w:lastColumn="0" w:lastRow="0" w:noHBand="0" w:noVBand="1" w:val="04A0"/>
-      </w:tblPr>
-      <w:tblGrid>
-        <w:gridCol w:w="4680"/>
-        <w:gridCol w:w="4680"/>
-      </w:tblGrid>
-      <w:tr>
-        <w:tc>
-          <w:tcPr>
-            <w:tcW w:type="dxa" w:w="2880"/>
-            <w:shd w:fill="F2F4F7"/>
-          </w:tcPr>
-          <w:p>
-            <w:r/>
-            <w:r>
-              <w:rPr>
-                <w:b/>
-                <w:sz w:val="18"/>
-              </w:rPr>
-              <w:t>Purpose</w:t>
-            </w:r>
-          </w:p>
-        </w:tc>
-        <w:tc>
-          <w:tcPr>
-            <w:tcW w:type="dxa" w:w="6480"/>
-            <w:shd w:fill="F2F4F7"/>
-          </w:tcPr>
-          <w:p>
-            <w:r/>
-            <w:r>
-              <w:rPr>
-                <w:b/>
-                <w:sz w:val="18"/>
-              </w:rPr>
-              <w:t>Files</w:t>
-            </w:r>
-          </w:p>
-        </w:tc>
-      </w:tr>
-      <w:tr>
-        <w:tc>
-          <w:tcPr>
-            <w:tcW w:type="dxa" w:w="2880"/>
-            <w:vAlign w:val="top"/>
-          </w:tcPr>
-          <w:p>
-            <w:r/>
-            <w:r>
-              <w:rPr>
-                <w:b w:val="0"/>
-                <w:sz w:val="18"/>
-              </w:rPr>
-              <w:t>Studio shell and theme</w:t>
-            </w:r>
-          </w:p>
-        </w:tc>
-        <w:tc>
-          <w:tcPr>
-            <w:tcW w:type="dxa" w:w="6480"/>
-            <w:vAlign w:val="top"/>
-          </w:tcPr>
-          <w:p>
-            <w:r/>
-            <w:r>
-              <w:rPr>
-                <w:b w:val="0"/>
-                <w:sz w:val="18"/>
-              </w:rPr>
-              <w:t>apps/studio/src/App.tsx</w:t>
-              <w:br/>
-              <w:t>apps/studio/src/App.css</w:t>
-            </w:r>
-          </w:p>
-        </w:tc>
-      </w:tr>
-      <w:tr>
-        <w:tc>
-          <w:tcPr>
-            <w:tcW w:type="dxa" w:w="2880"/>
-            <w:vAlign w:val="top"/>
-          </w:tcPr>
-          <w:p>
-            <w:r/>
-            <w:r>
-              <w:rPr>
-                <w:b w:val="0"/>
-                <w:sz w:val="18"/>
-              </w:rPr>
-              <w:t>Focused smoke coverage</w:t>
-            </w:r>
-          </w:p>
-        </w:tc>
-        <w:tc>
-          <w:tcPr>
-            <w:tcW w:type="dxa" w:w="6480"/>
-            <w:vAlign w:val="top"/>
-          </w:tcPr>
-          <w:p>
-            <w:r/>
-            <w:r>
-              <w:rPr>
-                <w:b w:val="0"/>
-                <w:sz w:val="18"/>
-              </w:rPr>
-              <w:t>tests/ui/studio_bot_smoke.py</w:t>
-            </w:r>
-          </w:p>
-        </w:tc>
-      </w:tr>
-      <w:tr>
-        <w:tc>
-          <w:tcPr>
-            <w:tcW w:type="dxa" w:w="2880"/>
-            <w:vAlign w:val="top"/>
-          </w:tcPr>
-          <w:p>
-            <w:r/>
-            <w:r>
-              <w:rPr>
-                <w:b w:val="0"/>
-                <w:sz w:val="18"/>
-              </w:rPr>
-              <w:t>Phase report evidence</w:t>
-            </w:r>
-          </w:p>
-        </w:tc>
-        <w:tc>
-          <w:tcPr>
-            <w:tcW w:type="dxa" w:w="6480"/>
-            <w:vAlign w:val="top"/>
-          </w:tcPr>
-          <w:p>
-            <w:r/>
-            <w:r>
-              <w:rPr>
-                <w:b w:val="0"/>
-                <w:sz w:val="18"/>
-              </w:rPr>
-              <w:t>docs/reports/phase-1-ai-editor-shell/baseline.md</w:t>
-              <w:br/>
-              <w:t>docs/reports/phase-1-ai-editor-shell/screenshots/before/*</w:t>
-              <w:br/>
-              <w:t>docs/reports/phase-1-ai-editor-shell/screenshots/after/*</w:t>
-              <w:br/>
-              <w:t>docs/reports/phase-1-ai-editor-shell/phase-1-ai-editor-shell-report.docx</w:t>
-            </w:r>
-          </w:p>
-        </w:tc>
-      </w:tr>
-    </w:tbl>
+    <w:p>
+      <w:pPr>
+        <w:pStyle w:val="Heading2"/>
+      </w:pPr>
+      <w:r>
+        <w:t>Studio shell and theme</w:t>
+      </w:r>
+    </w:p>
+    <w:p>
+      <w:pPr>
+        <w:pStyle w:val="ListBullet"/>
+      </w:pPr>
+      <w:r>
+        <w:t>apps/studio/src/App.tsx</w:t>
+      </w:r>
+    </w:p>
+    <w:p>
+      <w:pPr>
+        <w:pStyle w:val="ListBullet"/>
+      </w:pPr>
+      <w:r>
+        <w:t>apps/studio/src/App.css</w:t>
+      </w:r>
+    </w:p>
+    <w:p>
+      <w:pPr>
+        <w:pStyle w:val="Heading2"/>
+      </w:pPr>
+      <w:r>
+        <w:t>Focused smoke coverage</w:t>
+      </w:r>
+    </w:p>
+    <w:p>
+      <w:pPr>
+        <w:pStyle w:val="ListBullet"/>
+      </w:pPr>
+      <w:r>
+        <w:t>tests/ui/studio_bot_smoke.py</w:t>
+      </w:r>
+    </w:p>
+    <w:p>
+      <w:pPr>
+        <w:pStyle w:val="Heading2"/>
+      </w:pPr>
+      <w:r>
+        <w:t>Phase report and evidence</w:t>
+      </w:r>
+    </w:p>
+    <w:p>
+      <w:pPr>
+        <w:pStyle w:val="ListBullet"/>
+      </w:pPr>
+      <w:r>
+        <w:t>docs/reports/phase-1-ai-editor-shell/baseline.md</w:t>
+      </w:r>
+    </w:p>
+    <w:p>
+      <w:pPr>
+        <w:pStyle w:val="ListBullet"/>
+      </w:pPr>
+      <w:r>
+        <w:t>docs/reports/phase-1-ai-editor-shell/phase-1-ai-editor-shell-report.md</w:t>
+      </w:r>
+    </w:p>
+    <w:p>
+      <w:pPr>
+        <w:pStyle w:val="ListBullet"/>
+      </w:pPr>
+      <w:r>
+        <w:t>docs/reports/phase-1-ai-editor-shell/phase-1-ai-editor-shell-report.docx</w:t>
+      </w:r>
+    </w:p>
+    <w:p>
+      <w:pPr>
+        <w:pStyle w:val="ListBullet"/>
+      </w:pPr>
+      <w:r>
+        <w:t>docs/reports/phase-1-ai-editor-shell/rendered/README.md</w:t>
+      </w:r>
+    </w:p>
+    <w:p>
+      <w:pPr>
+        <w:pStyle w:val="ListBullet"/>
+      </w:pPr>
+      <w:r>
+        <w:t>docs/reports/phase-1-ai-editor-shell/screenshots/before/*</w:t>
+      </w:r>
+    </w:p>
+    <w:p>
+      <w:pPr>
+        <w:pStyle w:val="ListBullet"/>
+      </w:pPr>
+      <w:r>
+        <w:t>docs/reports/phase-1-ai-editor-shell/screenshots/after/*</w:t>
+      </w:r>
+    </w:p>
     <w:p>
       <w:pPr>
         <w:pStyle w:val="Heading1"/>
@@ -1075,19 +284,19 @@
       <w:tblPr>
         <w:tblStyle w:val="TableGrid"/>
         <w:tblW w:type="auto" w:w="0"/>
-        <w:jc w:val="center"/>
         <w:tblLook w:firstColumn="1" w:firstRow="1" w:lastColumn="0" w:lastRow="0" w:noHBand="0" w:noVBand="1" w:val="04A0"/>
       </w:tblPr>
       <w:tblGrid>
-        <w:gridCol w:w="3120"/>
-        <w:gridCol w:w="3120"/>
-        <w:gridCol w:w="3120"/>
+        <w:gridCol w:w="3389"/>
+        <w:gridCol w:w="3389"/>
+        <w:gridCol w:w="3389"/>
       </w:tblGrid>
       <w:tr>
         <w:tc>
           <w:tcPr>
-            <w:tcW w:type="dxa" w:w="1224"/>
-            <w:shd w:fill="F2F4F7"/>
+            <w:tcW w:type="dxa" w:w="3389"/>
+            <w:vAlign w:val="center"/>
+            <w:shd w:fill="DDEBE4"/>
           </w:tcPr>
           <w:p>
             <w:r/>
@@ -1102,8 +311,9 @@
         </w:tc>
         <w:tc>
           <w:tcPr>
-            <w:tcW w:type="dxa" w:w="3096"/>
-            <w:shd w:fill="F2F4F7"/>
+            <w:tcW w:type="dxa" w:w="3389"/>
+            <w:vAlign w:val="center"/>
+            <w:shd w:fill="DDEBE4"/>
           </w:tcPr>
           <w:p>
             <w:r/>
@@ -1118,8 +328,9 @@
         </w:tc>
         <w:tc>
           <w:tcPr>
-            <w:tcW w:type="dxa" w:w="5040"/>
-            <w:shd w:fill="F2F4F7"/>
+            <w:tcW w:type="dxa" w:w="3389"/>
+            <w:vAlign w:val="center"/>
+            <w:shd w:fill="DDEBE4"/>
           </w:tcPr>
           <w:p>
             <w:r/>
@@ -1136,8 +347,8 @@
       <w:tr>
         <w:tc>
           <w:tcPr>
-            <w:tcW w:type="dxa" w:w="1224"/>
-            <w:vAlign w:val="top"/>
+            <w:tcW w:type="dxa" w:w="3389"/>
+            <w:vAlign w:val="center"/>
           </w:tcPr>
           <w:p>
             <w:r/>
@@ -1152,8 +363,8 @@
         </w:tc>
         <w:tc>
           <w:tcPr>
-            <w:tcW w:type="dxa" w:w="3096"/>
-            <w:vAlign w:val="top"/>
+            <w:tcW w:type="dxa" w:w="3389"/>
+            <w:vAlign w:val="center"/>
           </w:tcPr>
           <w:p>
             <w:r/>
@@ -1168,8 +379,8 @@
         </w:tc>
         <w:tc>
           <w:tcPr>
-            <w:tcW w:type="dxa" w:w="5040"/>
-            <w:vAlign w:val="top"/>
+            <w:tcW w:type="dxa" w:w="3389"/>
+            <w:vAlign w:val="center"/>
           </w:tcPr>
           <w:p>
             <w:r/>
@@ -1178,7 +389,7 @@
                 <w:b w:val="0"/>
                 <w:sz w:val="18"/>
               </w:rPr>
-              <w:t>Recorded the initial dirty tree and Browser baseline screenshots.</w:t>
+              <w:t>Recorded initial dirty tree and Browser baseline screenshots for the studio surfaces.</w:t>
             </w:r>
           </w:p>
         </w:tc>
@@ -1186,8 +397,8 @@
       <w:tr>
         <w:tc>
           <w:tcPr>
-            <w:tcW w:type="dxa" w:w="1224"/>
-            <w:vAlign w:val="top"/>
+            <w:tcW w:type="dxa" w:w="3389"/>
+            <w:vAlign w:val="center"/>
           </w:tcPr>
           <w:p>
             <w:r/>
@@ -1202,8 +413,8 @@
         </w:tc>
         <w:tc>
           <w:tcPr>
-            <w:tcW w:type="dxa" w:w="3096"/>
-            <w:vAlign w:val="top"/>
+            <w:tcW w:type="dxa" w:w="3389"/>
+            <w:vAlign w:val="center"/>
           </w:tcPr>
           <w:p>
             <w:r/>
@@ -1218,8 +429,8 @@
         </w:tc>
         <w:tc>
           <w:tcPr>
-            <w:tcW w:type="dxa" w:w="5040"/>
-            <w:vAlign w:val="top"/>
+            <w:tcW w:type="dxa" w:w="3389"/>
+            <w:vAlign w:val="center"/>
           </w:tcPr>
           <w:p>
             <w:r/>
@@ -1228,7 +439,7 @@
                 <w:b w:val="0"/>
                 <w:sz w:val="18"/>
               </w:rPr>
-              <w:t>Introduced the off-white/mint light theme, blackish/navy dark theme, focus states, and shell tokens.</w:t>
+              <w:t>Added off-white/mint light tokens, blackish/navy dark tokens, focus states, and shell/preview/panel variables.</w:t>
             </w:r>
           </w:p>
         </w:tc>
@@ -1236,8 +447,8 @@
       <w:tr>
         <w:tc>
           <w:tcPr>
-            <w:tcW w:type="dxa" w:w="1224"/>
-            <w:vAlign w:val="top"/>
+            <w:tcW w:type="dxa" w:w="3389"/>
+            <w:vAlign w:val="center"/>
           </w:tcPr>
           <w:p>
             <w:r/>
@@ -1252,8 +463,8 @@
         </w:tc>
         <w:tc>
           <w:tcPr>
-            <w:tcW w:type="dxa" w:w="3096"/>
-            <w:vAlign w:val="top"/>
+            <w:tcW w:type="dxa" w:w="3389"/>
+            <w:vAlign w:val="center"/>
           </w:tcPr>
           <w:p>
             <w:r/>
@@ -1268,8 +479,8 @@
         </w:tc>
         <w:tc>
           <w:tcPr>
-            <w:tcW w:type="dxa" w:w="5040"/>
-            <w:vAlign w:val="top"/>
+            <w:tcW w:type="dxa" w:w="3389"/>
+            <w:vAlign w:val="center"/>
           </w:tcPr>
           <w:p>
             <w:r/>
@@ -1278,7 +489,7 @@
                 <w:b w:val="0"/>
                 <w:sz w:val="18"/>
               </w:rPr>
-              <w:t>Added the AI edit rail, preview workspace, status chips, inspector, and local selection placeholder state.</w:t>
+              <w:t>Added AI edit rail, live preview workspace, top status bar, inspector/context panels, and local placeholder selection state.</w:t>
             </w:r>
           </w:p>
         </w:tc>
@@ -1286,8 +497,8 @@
       <w:tr>
         <w:tc>
           <w:tcPr>
-            <w:tcW w:type="dxa" w:w="1224"/>
-            <w:vAlign w:val="top"/>
+            <w:tcW w:type="dxa" w:w="3389"/>
+            <w:vAlign w:val="center"/>
           </w:tcPr>
           <w:p>
             <w:r/>
@@ -1302,8 +513,8 @@
         </w:tc>
         <w:tc>
           <w:tcPr>
-            <w:tcW w:type="dxa" w:w="3096"/>
-            <w:vAlign w:val="top"/>
+            <w:tcW w:type="dxa" w:w="3389"/>
+            <w:vAlign w:val="center"/>
           </w:tcPr>
           <w:p>
             <w:r/>
@@ -1318,8 +529,8 @@
         </w:tc>
         <w:tc>
           <w:tcPr>
-            <w:tcW w:type="dxa" w:w="5040"/>
-            <w:vAlign w:val="top"/>
+            <w:tcW w:type="dxa" w:w="3389"/>
+            <w:vAlign w:val="center"/>
           </w:tcPr>
           <w:p>
             <w:r/>
@@ -1328,7 +539,7 @@
                 <w:b w:val="0"/>
                 <w:sz w:val="18"/>
               </w:rPr>
-              <w:t>Expanded the studio smoke around the AI shell, selected target, operation placeholder, and generated preview selection.</w:t>
+              <w:t>Expanded studio smoke around shell, selected target, operation placeholder, provider pages, theme toggles, and generated preview state.</w:t>
             </w:r>
           </w:p>
         </w:tc>
@@ -1336,8 +547,8 @@
       <w:tr>
         <w:tc>
           <w:tcPr>
-            <w:tcW w:type="dxa" w:w="1224"/>
-            <w:vAlign w:val="top"/>
+            <w:tcW w:type="dxa" w:w="3389"/>
+            <w:vAlign w:val="center"/>
           </w:tcPr>
           <w:p>
             <w:r/>
@@ -1352,8 +563,8 @@
         </w:tc>
         <w:tc>
           <w:tcPr>
-            <w:tcW w:type="dxa" w:w="3096"/>
-            <w:vAlign w:val="top"/>
+            <w:tcW w:type="dxa" w:w="3389"/>
+            <w:vAlign w:val="center"/>
           </w:tcPr>
           <w:p>
             <w:r/>
@@ -1368,8 +579,8 @@
         </w:tc>
         <w:tc>
           <w:tcPr>
-            <w:tcW w:type="dxa" w:w="5040"/>
-            <w:vAlign w:val="top"/>
+            <w:tcW w:type="dxa" w:w="3389"/>
+            <w:vAlign w:val="center"/>
           </w:tcPr>
           <w:p>
             <w:r/>
@@ -1378,7 +589,157 @@
                 <w:b w:val="0"/>
                 <w:sz w:val="18"/>
               </w:rPr>
-              <w:t>Tightened responsive shell behavior, selection outline styling, and themed scroll/root chrome.</w:t>
+              <w:t>Tightened selection-aware preview affordances, responsive shell behavior, and placeholder states.</w:t>
+            </w:r>
+          </w:p>
+        </w:tc>
+      </w:tr>
+      <w:tr>
+        <w:tc>
+          <w:tcPr>
+            <w:tcW w:type="dxa" w:w="3389"/>
+            <w:vAlign w:val="center"/>
+          </w:tcPr>
+          <w:p>
+            <w:r/>
+            <w:r>
+              <w:rPr>
+                <w:b w:val="0"/>
+                <w:sz w:val="18"/>
+              </w:rPr>
+              <w:t>09d3a59</w:t>
+            </w:r>
+          </w:p>
+        </w:tc>
+        <w:tc>
+          <w:tcPr>
+            <w:tcW w:type="dxa" w:w="3389"/>
+            <w:vAlign w:val="center"/>
+          </w:tcPr>
+          <w:p>
+            <w:r/>
+            <w:r>
+              <w:rPr>
+                <w:b w:val="0"/>
+                <w:sz w:val="18"/>
+              </w:rPr>
+              <w:t>chore(report): add phase 1 ui revamp report</w:t>
+            </w:r>
+          </w:p>
+        </w:tc>
+        <w:tc>
+          <w:tcPr>
+            <w:tcW w:type="dxa" w:w="3389"/>
+            <w:vAlign w:val="center"/>
+          </w:tcPr>
+          <w:p>
+            <w:r/>
+            <w:r>
+              <w:rPr>
+                <w:b w:val="0"/>
+                <w:sz w:val="18"/>
+              </w:rPr>
+              <w:t>Added the first Phase 1 report package and screenshot inventory.</w:t>
+            </w:r>
+          </w:p>
+        </w:tc>
+      </w:tr>
+      <w:tr>
+        <w:tc>
+          <w:tcPr>
+            <w:tcW w:type="dxa" w:w="3389"/>
+            <w:vAlign w:val="center"/>
+          </w:tcPr>
+          <w:p>
+            <w:r/>
+            <w:r>
+              <w:rPr>
+                <w:b w:val="0"/>
+                <w:sz w:val="18"/>
+              </w:rPr>
+              <w:t>bfe03ca</w:t>
+            </w:r>
+          </w:p>
+        </w:tc>
+        <w:tc>
+          <w:tcPr>
+            <w:tcW w:type="dxa" w:w="3389"/>
+            <w:vAlign w:val="center"/>
+          </w:tcPr>
+          <w:p>
+            <w:r/>
+            <w:r>
+              <w:rPr>
+                <w:b w:val="0"/>
+                <w:sz w:val="18"/>
+              </w:rPr>
+              <w:t>fix(studio): clarify chat and provider UI</w:t>
+            </w:r>
+          </w:p>
+        </w:tc>
+        <w:tc>
+          <w:tcPr>
+            <w:tcW w:type="dxa" w:w="3389"/>
+            <w:vAlign w:val="center"/>
+          </w:tcPr>
+          <w:p>
+            <w:r/>
+            <w:r>
+              <w:rPr>
+                <w:b w:val="0"/>
+                <w:sz w:val="18"/>
+              </w:rPr>
+              <w:t>Added user bubbles, direct markdown assistant responses, visible provider summaries, provider-in-response output, and clearer editor structure.</w:t>
+            </w:r>
+          </w:p>
+        </w:tc>
+      </w:tr>
+      <w:tr>
+        <w:tc>
+          <w:tcPr>
+            <w:tcW w:type="dxa" w:w="3389"/>
+            <w:vAlign w:val="center"/>
+          </w:tcPr>
+          <w:p>
+            <w:r/>
+            <w:r>
+              <w:rPr>
+                <w:b w:val="0"/>
+                <w:sz w:val="18"/>
+              </w:rPr>
+              <w:t>a38c354</w:t>
+            </w:r>
+          </w:p>
+        </w:tc>
+        <w:tc>
+          <w:tcPr>
+            <w:tcW w:type="dxa" w:w="3389"/>
+            <w:vAlign w:val="center"/>
+          </w:tcPr>
+          <w:p>
+            <w:r/>
+            <w:r>
+              <w:rPr>
+                <w:b w:val="0"/>
+                <w:sz w:val="18"/>
+              </w:rPr>
+              <w:t>fix(studio): make chat preview readable</w:t>
+            </w:r>
+          </w:p>
+        </w:tc>
+        <w:tc>
+          <w:tcPr>
+            <w:tcW w:type="dxa" w:w="3389"/>
+            <w:vAlign w:val="center"/>
+          </w:tcPr>
+          <w:p>
+            <w:r/>
+            <w:r>
+              <w:rPr>
+                <w:b w:val="0"/>
+                <w:sz w:val="18"/>
+              </w:rPr>
+              <w:t>Reworked chat + preview into a wider transcript, narrower preview rail, cleaner topbar, and less visually noisy app surface.</w:t>
             </w:r>
           </w:p>
         </w:tc>
@@ -1396,19 +757,18 @@
       <w:tblPr>
         <w:tblStyle w:val="TableGrid"/>
         <w:tblW w:type="auto" w:w="0"/>
-        <w:jc w:val="center"/>
         <w:tblLook w:firstColumn="1" w:firstRow="1" w:lastColumn="0" w:lastRow="0" w:noHBand="0" w:noVBand="1" w:val="04A0"/>
       </w:tblPr>
       <w:tblGrid>
-        <w:gridCol w:w="3120"/>
-        <w:gridCol w:w="3120"/>
-        <w:gridCol w:w="3120"/>
+        <w:gridCol w:w="5083"/>
+        <w:gridCol w:w="5083"/>
       </w:tblGrid>
       <w:tr>
         <w:tc>
           <w:tcPr>
-            <w:tcW w:type="dxa" w:w="2664"/>
-            <w:shd w:fill="F2F4F7"/>
+            <w:tcW w:type="dxa" w:w="5083"/>
+            <w:vAlign w:val="center"/>
+            <w:shd w:fill="DDEBE4"/>
           </w:tcPr>
           <w:p>
             <w:r/>
@@ -1423,8 +783,9 @@
         </w:tc>
         <w:tc>
           <w:tcPr>
-            <w:tcW w:type="dxa" w:w="1080"/>
-            <w:shd w:fill="F2F4F7"/>
+            <w:tcW w:type="dxa" w:w="5083"/>
+            <w:vAlign w:val="center"/>
+            <w:shd w:fill="DDEBE4"/>
           </w:tcPr>
           <w:p>
             <w:r/>
@@ -1437,19 +798,37 @@
             </w:r>
           </w:p>
         </w:tc>
+      </w:tr>
+      <w:tr>
         <w:tc>
           <w:tcPr>
-            <w:tcW w:type="dxa" w:w="5616"/>
-            <w:shd w:fill="F2F4F7"/>
+            <w:tcW w:type="dxa" w:w="5083"/>
+            <w:vAlign w:val="center"/>
           </w:tcPr>
           <w:p>
             <w:r/>
             <w:r>
               <w:rPr>
-                <w:b/>
+                <w:b w:val="0"/>
                 <w:sz w:val="18"/>
               </w:rPr>
-              <w:t>Notes</w:t>
+              <w:t>npm --workspace @strut/studio run check</w:t>
+            </w:r>
+          </w:p>
+        </w:tc>
+        <w:tc>
+          <w:tcPr>
+            <w:tcW w:type="dxa" w:w="5083"/>
+            <w:vAlign w:val="center"/>
+          </w:tcPr>
+          <w:p>
+            <w:r/>
+            <w:r>
+              <w:rPr>
+                <w:b w:val="0"/>
+                <w:sz w:val="18"/>
+              </w:rPr>
+              <w:t>PASS</w:t>
             </w:r>
           </w:p>
         </w:tc>
@@ -1457,8 +836,8 @@
       <w:tr>
         <w:tc>
           <w:tcPr>
-            <w:tcW w:type="dxa" w:w="2664"/>
-            <w:vAlign w:val="top"/>
+            <w:tcW w:type="dxa" w:w="5083"/>
+            <w:vAlign w:val="center"/>
           </w:tcPr>
           <w:p>
             <w:r/>
@@ -1473,8 +852,8 @@
         </w:tc>
         <w:tc>
           <w:tcPr>
-            <w:tcW w:type="dxa" w:w="1080"/>
-            <w:vAlign w:val="top"/>
+            <w:tcW w:type="dxa" w:w="5083"/>
+            <w:vAlign w:val="center"/>
           </w:tcPr>
           <w:p>
             <w:r/>
@@ -1487,28 +866,12 @@
             </w:r>
           </w:p>
         </w:tc>
-        <w:tc>
-          <w:tcPr>
-            <w:tcW w:type="dxa" w:w="5616"/>
-            <w:vAlign w:val="top"/>
-          </w:tcPr>
-          <w:p>
-            <w:r/>
-            <w:r>
-              <w:rPr>
-                <w:b w:val="0"/>
-                <w:sz w:val="18"/>
-              </w:rPr>
-              <w:t>TypeScript checks for studio/runtime packages and cargo check completed.</w:t>
-            </w:r>
-          </w:p>
-        </w:tc>
       </w:tr>
       <w:tr>
         <w:tc>
           <w:tcPr>
-            <w:tcW w:type="dxa" w:w="2664"/>
-            <w:vAlign w:val="top"/>
+            <w:tcW w:type="dxa" w:w="5083"/>
+            <w:vAlign w:val="center"/>
           </w:tcPr>
           <w:p>
             <w:r/>
@@ -1523,8 +886,8 @@
         </w:tc>
         <w:tc>
           <w:tcPr>
-            <w:tcW w:type="dxa" w:w="1080"/>
-            <w:vAlign w:val="top"/>
+            <w:tcW w:type="dxa" w:w="5083"/>
+            <w:vAlign w:val="center"/>
           </w:tcPr>
           <w:p>
             <w:r/>
@@ -1533,23 +896,7 @@
                 <w:b w:val="0"/>
                 <w:sz w:val="18"/>
               </w:rPr>
-              <w:t>PASS</w:t>
-            </w:r>
-          </w:p>
-        </w:tc>
-        <w:tc>
-          <w:tcPr>
-            <w:tcW w:type="dxa" w:w="5616"/>
-            <w:vAlign w:val="top"/>
-          </w:tcPr>
-          <w:p>
-            <w:r/>
-            <w:r>
-              <w:rPr>
-                <w:b w:val="0"/>
-                <w:sz w:val="18"/>
-              </w:rPr>
-              <w:t>All Rust workspace tests passed: 1 + 4 + 5 + 1 + 14 passed; one authenticated Gemini CLI test remained intentionally ignored.</w:t>
+              <w:t>PASS; authenticated Gemini CLI e2e remains intentionally ignored</w:t>
             </w:r>
           </w:p>
         </w:tc>
@@ -1557,8 +904,8 @@
       <w:tr>
         <w:tc>
           <w:tcPr>
-            <w:tcW w:type="dxa" w:w="2664"/>
-            <w:vAlign w:val="top"/>
+            <w:tcW w:type="dxa" w:w="5083"/>
+            <w:vAlign w:val="center"/>
           </w:tcPr>
           <w:p>
             <w:r/>
@@ -1573,8 +920,8 @@
         </w:tc>
         <w:tc>
           <w:tcPr>
-            <w:tcW w:type="dxa" w:w="1080"/>
-            <w:vAlign w:val="top"/>
+            <w:tcW w:type="dxa" w:w="5083"/>
+            <w:vAlign w:val="center"/>
           </w:tcPr>
           <w:p>
             <w:r/>
@@ -1587,10 +934,12 @@
             </w:r>
           </w:p>
         </w:tc>
+      </w:tr>
+      <w:tr>
         <w:tc>
           <w:tcPr>
-            <w:tcW w:type="dxa" w:w="5616"/>
-            <w:vAlign w:val="top"/>
+            <w:tcW w:type="dxa" w:w="5083"/>
+            <w:vAlign w:val="center"/>
           </w:tcPr>
           <w:p>
             <w:r/>
@@ -1599,7 +948,23 @@
                 <w:b w:val="0"/>
                 <w:sz w:val="18"/>
               </w:rPr>
-              <w:t>Studio browser smoke passed, including Phase 1 shell assertions and seeded generated preview selection.</w:t>
+              <w:t>git diff --check</w:t>
+            </w:r>
+          </w:p>
+        </w:tc>
+        <w:tc>
+          <w:tcPr>
+            <w:tcW w:type="dxa" w:w="5083"/>
+            <w:vAlign w:val="center"/>
+          </w:tcPr>
+          <w:p>
+            <w:r/>
+            <w:r>
+              <w:rPr>
+                <w:b w:val="0"/>
+                <w:sz w:val="18"/>
+              </w:rPr>
+              <w:t>PASS</w:t>
             </w:r>
           </w:p>
         </w:tc>
@@ -1607,8 +972,8 @@
       <w:tr>
         <w:tc>
           <w:tcPr>
-            <w:tcW w:type="dxa" w:w="2664"/>
-            <w:vAlign w:val="top"/>
+            <w:tcW w:type="dxa" w:w="5083"/>
+            <w:vAlign w:val="center"/>
           </w:tcPr>
           <w:p>
             <w:r/>
@@ -1623,8 +988,8 @@
         </w:tc>
         <w:tc>
           <w:tcPr>
-            <w:tcW w:type="dxa" w:w="1080"/>
-            <w:vAlign w:val="top"/>
+            <w:tcW w:type="dxa" w:w="5083"/>
+            <w:vAlign w:val="center"/>
           </w:tcPr>
           <w:p>
             <w:r/>
@@ -1633,28 +998,1208 @@
                 <w:b w:val="0"/>
                 <w:sz w:val="18"/>
               </w:rPr>
-              <w:t>PASS</w:t>
-            </w:r>
-          </w:p>
-        </w:tc>
-        <w:tc>
-          <w:tcPr>
-            <w:tcW w:type="dxa" w:w="5616"/>
-            <w:vAlign w:val="top"/>
-          </w:tcPr>
-          <w:p>
-            <w:r/>
-            <w:r>
-              <w:rPr>
-                <w:b w:val="0"/>
-                <w:sz w:val="18"/>
-              </w:rPr>
-              <w:t>Captured desktop light/dark, narrow light/dark, empty preview, providers/settings, and editor shell screenshots. Generated preview proof used the seeded smoke because browser-only generation stops at the expected desktop-runtime fallback.</w:t>
+              <w:t>PASS; fresh screenshots captured from current HEAD</w:t>
             </w:r>
           </w:p>
         </w:tc>
       </w:tr>
     </w:tbl>
+    <w:p>
+      <w:pPr>
+        <w:pStyle w:val="Heading1"/>
+      </w:pPr>
+      <w:r>
+        <w:t>Before And After Comparison Notes</w:t>
+      </w:r>
+    </w:p>
+    <w:p>
+      <w:pPr>
+        <w:pStyle w:val="ListBullet"/>
+      </w:pPr>
+      <w:r>
+        <w:t>Chat + preview changed from a grid-dominant canvas surface with a floating composer into a readable transcript with user bubble, direct markdown response, bottom composer, and narrow preview rail.</w:t>
+      </w:r>
+    </w:p>
+    <w:p>
+      <w:pPr>
+        <w:pStyle w:val="ListBullet"/>
+      </w:pPr>
+      <w:r>
+        <w:t>Editor shell keeps Phase 1 placeholders visible without implementing real Phase 2 hit-testing or operation patches.</w:t>
+      </w:r>
+    </w:p>
+    <w:p>
+      <w:pPr>
+        <w:pStyle w:val="ListBullet"/>
+      </w:pPr>
+      <w:r>
+        <w:t>Provider page now clearly marks the selected provider and the same provider appears across chrome, settings, composer, and assistant responses.</w:t>
+      </w:r>
+    </w:p>
+    <w:p>
+      <w:pPr>
+        <w:pStyle w:val="ListBullet"/>
+      </w:pPr>
+      <w:r>
+        <w:t>Light and dark mode screenshots confirm stable app chrome and theme tokens.</w:t>
+      </w:r>
+    </w:p>
+    <w:p>
+      <w:pPr>
+        <w:pStyle w:val="ListBullet"/>
+      </w:pPr>
+      <w:r>
+        <w:t>Narrow screenshots confirm the shell stacks without horizontal overflow.</w:t>
+      </w:r>
+    </w:p>
+    <w:p>
+      <w:pPr>
+        <w:pStyle w:val="Heading1"/>
+      </w:pPr>
+      <w:r>
+        <w:t>Final After Screenshot Gallery</w:t>
+      </w:r>
+    </w:p>
+    <w:p>
+      <w:pPr>
+        <w:jc w:val="center"/>
+      </w:pPr>
+      <w:r>
+        <w:drawing>
+          <wp:inline xmlns:a="http://schemas.openxmlformats.org/drawingml/2006/main" xmlns:pic="http://schemas.openxmlformats.org/drawingml/2006/picture">
+            <wp:extent cx="5320145" cy="2992582"/>
+            <wp:docPr id="1" name="Picture 1"/>
+            <wp:cNvGraphicFramePr>
+              <a:graphicFrameLocks noChangeAspect="1"/>
+            </wp:cNvGraphicFramePr>
+            <a:graphic>
+              <a:graphicData uri="http://schemas.openxmlformats.org/drawingml/2006/picture">
+                <pic:pic>
+                  <pic:nvPicPr>
+                    <pic:cNvPr id="0" name="after-01-main-workspace-light.png"/>
+                    <pic:cNvPicPr/>
+                  </pic:nvPicPr>
+                  <pic:blipFill>
+                    <a:blip r:embed="rId9"/>
+                    <a:stretch>
+                      <a:fillRect/>
+                    </a:stretch>
+                  </pic:blipFill>
+                  <pic:spPr>
+                    <a:xfrm>
+                      <a:off x="0" y="0"/>
+                      <a:ext cx="5320145" cy="2992582"/>
+                    </a:xfrm>
+                    <a:prstGeom prst="rect"/>
+                  </pic:spPr>
+                </pic:pic>
+              </a:graphicData>
+            </a:graphic>
+          </wp:inline>
+        </w:drawing>
+      </w:r>
+    </w:p>
+    <w:p>
+      <w:pPr>
+        <w:jc w:val="center"/>
+      </w:pPr>
+      <w:r>
+        <w:rPr>
+          <w:color w:val="5A6560"/>
+          <w:sz w:val="16"/>
+        </w:rPr>
+        <w:t>Desktop main workspace light - screenshots/after/after-01-main-workspace-light.png</w:t>
+      </w:r>
+    </w:p>
+    <w:p>
+      <w:pPr>
+        <w:jc w:val="center"/>
+      </w:pPr>
+      <w:r>
+        <w:drawing>
+          <wp:inline xmlns:a="http://schemas.openxmlformats.org/drawingml/2006/main" xmlns:pic="http://schemas.openxmlformats.org/drawingml/2006/picture">
+            <wp:extent cx="5320145" cy="2992582"/>
+            <wp:docPr id="2" name="Picture 2"/>
+            <wp:cNvGraphicFramePr>
+              <a:graphicFrameLocks noChangeAspect="1"/>
+            </wp:cNvGraphicFramePr>
+            <a:graphic>
+              <a:graphicData uri="http://schemas.openxmlformats.org/drawingml/2006/picture">
+                <pic:pic>
+                  <pic:nvPicPr>
+                    <pic:cNvPr id="0" name="after-02-chat-generation-state-light.png"/>
+                    <pic:cNvPicPr/>
+                  </pic:nvPicPr>
+                  <pic:blipFill>
+                    <a:blip r:embed="rId10"/>
+                    <a:stretch>
+                      <a:fillRect/>
+                    </a:stretch>
+                  </pic:blipFill>
+                  <pic:spPr>
+                    <a:xfrm>
+                      <a:off x="0" y="0"/>
+                      <a:ext cx="5320145" cy="2992582"/>
+                    </a:xfrm>
+                    <a:prstGeom prst="rect"/>
+                  </pic:spPr>
+                </pic:pic>
+              </a:graphicData>
+            </a:graphic>
+          </wp:inline>
+        </w:drawing>
+      </w:r>
+    </w:p>
+    <w:p>
+      <w:pPr>
+        <w:jc w:val="center"/>
+      </w:pPr>
+      <w:r>
+        <w:rPr>
+          <w:color w:val="5A6560"/>
+          <w:sz w:val="16"/>
+        </w:rPr>
+        <w:t>Desktop chat + preview light - screenshots/after/after-02-chat-generation-state-light.png</w:t>
+      </w:r>
+    </w:p>
+    <w:p>
+      <w:pPr>
+        <w:jc w:val="center"/>
+      </w:pPr>
+      <w:r>
+        <w:drawing>
+          <wp:inline xmlns:a="http://schemas.openxmlformats.org/drawingml/2006/main" xmlns:pic="http://schemas.openxmlformats.org/drawingml/2006/picture">
+            <wp:extent cx="5320145" cy="2992582"/>
+            <wp:docPr id="3" name="Picture 3"/>
+            <wp:cNvGraphicFramePr>
+              <a:graphicFrameLocks noChangeAspect="1"/>
+            </wp:cNvGraphicFramePr>
+            <a:graphic>
+              <a:graphicData uri="http://schemas.openxmlformats.org/drawingml/2006/picture">
+                <pic:pic>
+                  <pic:nvPicPr>
+                    <pic:cNvPr id="0" name="after-03-empty-preview-light.png"/>
+                    <pic:cNvPicPr/>
+                  </pic:nvPicPr>
+                  <pic:blipFill>
+                    <a:blip r:embed="rId11"/>
+                    <a:stretch>
+                      <a:fillRect/>
+                    </a:stretch>
+                  </pic:blipFill>
+                  <pic:spPr>
+                    <a:xfrm>
+                      <a:off x="0" y="0"/>
+                      <a:ext cx="5320145" cy="2992582"/>
+                    </a:xfrm>
+                    <a:prstGeom prst="rect"/>
+                  </pic:spPr>
+                </pic:pic>
+              </a:graphicData>
+            </a:graphic>
+          </wp:inline>
+        </w:drawing>
+      </w:r>
+    </w:p>
+    <w:p>
+      <w:pPr>
+        <w:jc w:val="center"/>
+      </w:pPr>
+      <w:r>
+        <w:rPr>
+          <w:color w:val="5A6560"/>
+          <w:sz w:val="16"/>
+        </w:rPr>
+        <w:t>Desktop empty preview light - screenshots/after/after-03-empty-preview-light.png</w:t>
+      </w:r>
+    </w:p>
+    <w:p>
+      <w:pPr>
+        <w:jc w:val="center"/>
+      </w:pPr>
+      <w:r>
+        <w:drawing>
+          <wp:inline xmlns:a="http://schemas.openxmlformats.org/drawingml/2006/main" xmlns:pic="http://schemas.openxmlformats.org/drawingml/2006/picture">
+            <wp:extent cx="5320145" cy="2992582"/>
+            <wp:docPr id="4" name="Picture 4"/>
+            <wp:cNvGraphicFramePr>
+              <a:graphicFrameLocks noChangeAspect="1"/>
+            </wp:cNvGraphicFramePr>
+            <a:graphic>
+              <a:graphicData uri="http://schemas.openxmlformats.org/drawingml/2006/picture">
+                <pic:pic>
+                  <pic:nvPicPr>
+                    <pic:cNvPr id="0" name="after-04-ai-editor-shell-light.png"/>
+                    <pic:cNvPicPr/>
+                  </pic:nvPicPr>
+                  <pic:blipFill>
+                    <a:blip r:embed="rId12"/>
+                    <a:stretch>
+                      <a:fillRect/>
+                    </a:stretch>
+                  </pic:blipFill>
+                  <pic:spPr>
+                    <a:xfrm>
+                      <a:off x="0" y="0"/>
+                      <a:ext cx="5320145" cy="2992582"/>
+                    </a:xfrm>
+                    <a:prstGeom prst="rect"/>
+                  </pic:spPr>
+                </pic:pic>
+              </a:graphicData>
+            </a:graphic>
+          </wp:inline>
+        </w:drawing>
+      </w:r>
+    </w:p>
+    <w:p>
+      <w:pPr>
+        <w:jc w:val="center"/>
+      </w:pPr>
+      <w:r>
+        <w:rPr>
+          <w:color w:val="5A6560"/>
+          <w:sz w:val="16"/>
+        </w:rPr>
+        <w:t>Desktop editor shell light - screenshots/after/after-04-ai-editor-shell-light.png</w:t>
+      </w:r>
+    </w:p>
+    <w:p>
+      <w:pPr>
+        <w:jc w:val="center"/>
+      </w:pPr>
+      <w:r>
+        <w:drawing>
+          <wp:inline xmlns:a="http://schemas.openxmlformats.org/drawingml/2006/main" xmlns:pic="http://schemas.openxmlformats.org/drawingml/2006/picture">
+            <wp:extent cx="5320145" cy="2992582"/>
+            <wp:docPr id="5" name="Picture 5"/>
+            <wp:cNvGraphicFramePr>
+              <a:graphicFrameLocks noChangeAspect="1"/>
+            </wp:cNvGraphicFramePr>
+            <a:graphic>
+              <a:graphicData uri="http://schemas.openxmlformats.org/drawingml/2006/picture">
+                <pic:pic>
+                  <pic:nvPicPr>
+                    <pic:cNvPr id="0" name="after-05-provider-page-light.png"/>
+                    <pic:cNvPicPr/>
+                  </pic:nvPicPr>
+                  <pic:blipFill>
+                    <a:blip r:embed="rId13"/>
+                    <a:stretch>
+                      <a:fillRect/>
+                    </a:stretch>
+                  </pic:blipFill>
+                  <pic:spPr>
+                    <a:xfrm>
+                      <a:off x="0" y="0"/>
+                      <a:ext cx="5320145" cy="2992582"/>
+                    </a:xfrm>
+                    <a:prstGeom prst="rect"/>
+                  </pic:spPr>
+                </pic:pic>
+              </a:graphicData>
+            </a:graphic>
+          </wp:inline>
+        </w:drawing>
+      </w:r>
+    </w:p>
+    <w:p>
+      <w:pPr>
+        <w:jc w:val="center"/>
+      </w:pPr>
+      <w:r>
+        <w:rPr>
+          <w:color w:val="5A6560"/>
+          <w:sz w:val="16"/>
+        </w:rPr>
+        <w:t>Desktop provider page light - screenshots/after/after-05-provider-page-light.png</w:t>
+      </w:r>
+    </w:p>
+    <w:p>
+      <w:pPr>
+        <w:jc w:val="center"/>
+      </w:pPr>
+      <w:r>
+        <w:drawing>
+          <wp:inline xmlns:a="http://schemas.openxmlformats.org/drawingml/2006/main" xmlns:pic="http://schemas.openxmlformats.org/drawingml/2006/picture">
+            <wp:extent cx="5320145" cy="2992582"/>
+            <wp:docPr id="6" name="Picture 6"/>
+            <wp:cNvGraphicFramePr>
+              <a:graphicFrameLocks noChangeAspect="1"/>
+            </wp:cNvGraphicFramePr>
+            <a:graphic>
+              <a:graphicData uri="http://schemas.openxmlformats.org/drawingml/2006/picture">
+                <pic:pic>
+                  <pic:nvPicPr>
+                    <pic:cNvPr id="0" name="after-06-settings-page-light.png"/>
+                    <pic:cNvPicPr/>
+                  </pic:nvPicPr>
+                  <pic:blipFill>
+                    <a:blip r:embed="rId14"/>
+                    <a:stretch>
+                      <a:fillRect/>
+                    </a:stretch>
+                  </pic:blipFill>
+                  <pic:spPr>
+                    <a:xfrm>
+                      <a:off x="0" y="0"/>
+                      <a:ext cx="5320145" cy="2992582"/>
+                    </a:xfrm>
+                    <a:prstGeom prst="rect"/>
+                  </pic:spPr>
+                </pic:pic>
+              </a:graphicData>
+            </a:graphic>
+          </wp:inline>
+        </w:drawing>
+      </w:r>
+    </w:p>
+    <w:p>
+      <w:pPr>
+        <w:jc w:val="center"/>
+      </w:pPr>
+      <w:r>
+        <w:rPr>
+          <w:color w:val="5A6560"/>
+          <w:sz w:val="16"/>
+        </w:rPr>
+        <w:t>Desktop settings light - screenshots/after/after-06-settings-page-light.png</w:t>
+      </w:r>
+    </w:p>
+    <w:p>
+      <w:pPr>
+        <w:jc w:val="center"/>
+      </w:pPr>
+      <w:r>
+        <w:drawing>
+          <wp:inline xmlns:a="http://schemas.openxmlformats.org/drawingml/2006/main" xmlns:pic="http://schemas.openxmlformats.org/drawingml/2006/picture">
+            <wp:extent cx="5320145" cy="2992582"/>
+            <wp:docPr id="7" name="Picture 7"/>
+            <wp:cNvGraphicFramePr>
+              <a:graphicFrameLocks noChangeAspect="1"/>
+            </wp:cNvGraphicFramePr>
+            <a:graphic>
+              <a:graphicData uri="http://schemas.openxmlformats.org/drawingml/2006/picture">
+                <pic:pic>
+                  <pic:nvPicPr>
+                    <pic:cNvPr id="0" name="after-07-settings-page-dark.png"/>
+                    <pic:cNvPicPr/>
+                  </pic:nvPicPr>
+                  <pic:blipFill>
+                    <a:blip r:embed="rId15"/>
+                    <a:stretch>
+                      <a:fillRect/>
+                    </a:stretch>
+                  </pic:blipFill>
+                  <pic:spPr>
+                    <a:xfrm>
+                      <a:off x="0" y="0"/>
+                      <a:ext cx="5320145" cy="2992582"/>
+                    </a:xfrm>
+                    <a:prstGeom prst="rect"/>
+                  </pic:spPr>
+                </pic:pic>
+              </a:graphicData>
+            </a:graphic>
+          </wp:inline>
+        </w:drawing>
+      </w:r>
+    </w:p>
+    <w:p>
+      <w:pPr>
+        <w:jc w:val="center"/>
+      </w:pPr>
+      <w:r>
+        <w:rPr>
+          <w:color w:val="5A6560"/>
+          <w:sz w:val="16"/>
+        </w:rPr>
+        <w:t>Desktop settings dark - screenshots/after/after-07-settings-page-dark.png</w:t>
+      </w:r>
+    </w:p>
+    <w:p>
+      <w:pPr>
+        <w:jc w:val="center"/>
+      </w:pPr>
+      <w:r>
+        <w:drawing>
+          <wp:inline xmlns:a="http://schemas.openxmlformats.org/drawingml/2006/main" xmlns:pic="http://schemas.openxmlformats.org/drawingml/2006/picture">
+            <wp:extent cx="5320145" cy="2992582"/>
+            <wp:docPr id="8" name="Picture 8"/>
+            <wp:cNvGraphicFramePr>
+              <a:graphicFrameLocks noChangeAspect="1"/>
+            </wp:cNvGraphicFramePr>
+            <a:graphic>
+              <a:graphicData uri="http://schemas.openxmlformats.org/drawingml/2006/picture">
+                <pic:pic>
+                  <pic:nvPicPr>
+                    <pic:cNvPr id="0" name="after-08-empty-preview-dark.png"/>
+                    <pic:cNvPicPr/>
+                  </pic:nvPicPr>
+                  <pic:blipFill>
+                    <a:blip r:embed="rId16"/>
+                    <a:stretch>
+                      <a:fillRect/>
+                    </a:stretch>
+                  </pic:blipFill>
+                  <pic:spPr>
+                    <a:xfrm>
+                      <a:off x="0" y="0"/>
+                      <a:ext cx="5320145" cy="2992582"/>
+                    </a:xfrm>
+                    <a:prstGeom prst="rect"/>
+                  </pic:spPr>
+                </pic:pic>
+              </a:graphicData>
+            </a:graphic>
+          </wp:inline>
+        </w:drawing>
+      </w:r>
+    </w:p>
+    <w:p>
+      <w:pPr>
+        <w:jc w:val="center"/>
+      </w:pPr>
+      <w:r>
+        <w:rPr>
+          <w:color w:val="5A6560"/>
+          <w:sz w:val="16"/>
+        </w:rPr>
+        <w:t>Desktop empty preview dark - screenshots/after/after-08-empty-preview-dark.png</w:t>
+      </w:r>
+    </w:p>
+    <w:p>
+      <w:pPr>
+        <w:jc w:val="center"/>
+      </w:pPr>
+      <w:r>
+        <w:drawing>
+          <wp:inline xmlns:a="http://schemas.openxmlformats.org/drawingml/2006/main" xmlns:pic="http://schemas.openxmlformats.org/drawingml/2006/picture">
+            <wp:extent cx="5320145" cy="2992582"/>
+            <wp:docPr id="9" name="Picture 9"/>
+            <wp:cNvGraphicFramePr>
+              <a:graphicFrameLocks noChangeAspect="1"/>
+            </wp:cNvGraphicFramePr>
+            <a:graphic>
+              <a:graphicData uri="http://schemas.openxmlformats.org/drawingml/2006/picture">
+                <pic:pic>
+                  <pic:nvPicPr>
+                    <pic:cNvPr id="0" name="after-09-ai-editor-shell-dark.png"/>
+                    <pic:cNvPicPr/>
+                  </pic:nvPicPr>
+                  <pic:blipFill>
+                    <a:blip r:embed="rId17"/>
+                    <a:stretch>
+                      <a:fillRect/>
+                    </a:stretch>
+                  </pic:blipFill>
+                  <pic:spPr>
+                    <a:xfrm>
+                      <a:off x="0" y="0"/>
+                      <a:ext cx="5320145" cy="2992582"/>
+                    </a:xfrm>
+                    <a:prstGeom prst="rect"/>
+                  </pic:spPr>
+                </pic:pic>
+              </a:graphicData>
+            </a:graphic>
+          </wp:inline>
+        </w:drawing>
+      </w:r>
+    </w:p>
+    <w:p>
+      <w:pPr>
+        <w:jc w:val="center"/>
+      </w:pPr>
+      <w:r>
+        <w:rPr>
+          <w:color w:val="5A6560"/>
+          <w:sz w:val="16"/>
+        </w:rPr>
+        <w:t>Desktop editor shell dark - screenshots/after/after-09-ai-editor-shell-dark.png</w:t>
+      </w:r>
+    </w:p>
+    <w:p>
+      <w:pPr>
+        <w:jc w:val="center"/>
+      </w:pPr>
+      <w:r>
+        <w:drawing>
+          <wp:inline xmlns:a="http://schemas.openxmlformats.org/drawingml/2006/main" xmlns:pic="http://schemas.openxmlformats.org/drawingml/2006/picture">
+            <wp:extent cx="2011680" cy="4184294"/>
+            <wp:docPr id="10" name="Picture 10"/>
+            <wp:cNvGraphicFramePr>
+              <a:graphicFrameLocks noChangeAspect="1"/>
+            </wp:cNvGraphicFramePr>
+            <a:graphic>
+              <a:graphicData uri="http://schemas.openxmlformats.org/drawingml/2006/picture">
+                <pic:pic>
+                  <pic:nvPicPr>
+                    <pic:cNvPr id="0" name="after-10-narrow-chat-light.png"/>
+                    <pic:cNvPicPr/>
+                  </pic:nvPicPr>
+                  <pic:blipFill>
+                    <a:blip r:embed="rId18"/>
+                    <a:stretch>
+                      <a:fillRect/>
+                    </a:stretch>
+                  </pic:blipFill>
+                  <pic:spPr>
+                    <a:xfrm>
+                      <a:off x="0" y="0"/>
+                      <a:ext cx="2011680" cy="4184294"/>
+                    </a:xfrm>
+                    <a:prstGeom prst="rect"/>
+                  </pic:spPr>
+                </pic:pic>
+              </a:graphicData>
+            </a:graphic>
+          </wp:inline>
+        </w:drawing>
+      </w:r>
+    </w:p>
+    <w:p>
+      <w:pPr>
+        <w:jc w:val="center"/>
+      </w:pPr>
+      <w:r>
+        <w:rPr>
+          <w:color w:val="5A6560"/>
+          <w:sz w:val="16"/>
+        </w:rPr>
+        <w:t>Narrow chat + preview light - screenshots/after/after-10-narrow-chat-light.png</w:t>
+      </w:r>
+    </w:p>
+    <w:p>
+      <w:pPr>
+        <w:jc w:val="center"/>
+      </w:pPr>
+      <w:r>
+        <w:drawing>
+          <wp:inline xmlns:a="http://schemas.openxmlformats.org/drawingml/2006/main" xmlns:pic="http://schemas.openxmlformats.org/drawingml/2006/picture">
+            <wp:extent cx="2011680" cy="4184294"/>
+            <wp:docPr id="11" name="Picture 11"/>
+            <wp:cNvGraphicFramePr>
+              <a:graphicFrameLocks noChangeAspect="1"/>
+            </wp:cNvGraphicFramePr>
+            <a:graphic>
+              <a:graphicData uri="http://schemas.openxmlformats.org/drawingml/2006/picture">
+                <pic:pic>
+                  <pic:nvPicPr>
+                    <pic:cNvPr id="0" name="after-11-narrow-editor-dark.png"/>
+                    <pic:cNvPicPr/>
+                  </pic:nvPicPr>
+                  <pic:blipFill>
+                    <a:blip r:embed="rId19"/>
+                    <a:stretch>
+                      <a:fillRect/>
+                    </a:stretch>
+                  </pic:blipFill>
+                  <pic:spPr>
+                    <a:xfrm>
+                      <a:off x="0" y="0"/>
+                      <a:ext cx="2011680" cy="4184294"/>
+                    </a:xfrm>
+                    <a:prstGeom prst="rect"/>
+                  </pic:spPr>
+                </pic:pic>
+              </a:graphicData>
+            </a:graphic>
+          </wp:inline>
+        </w:drawing>
+      </w:r>
+    </w:p>
+    <w:p>
+      <w:pPr>
+        <w:jc w:val="center"/>
+      </w:pPr>
+      <w:r>
+        <w:rPr>
+          <w:color w:val="5A6560"/>
+          <w:sz w:val="16"/>
+        </w:rPr>
+        <w:t>Narrow editor dark - screenshots/after/after-11-narrow-editor-dark.png</w:t>
+      </w:r>
+    </w:p>
+    <w:p>
+      <w:pPr>
+        <w:jc w:val="center"/>
+      </w:pPr>
+      <w:r>
+        <w:drawing>
+          <wp:inline xmlns:a="http://schemas.openxmlformats.org/drawingml/2006/main" xmlns:pic="http://schemas.openxmlformats.org/drawingml/2006/picture">
+            <wp:extent cx="5577840" cy="3563620"/>
+            <wp:docPr id="12" name="Picture 12"/>
+            <wp:cNvGraphicFramePr>
+              <a:graphicFrameLocks noChangeAspect="1"/>
+            </wp:cNvGraphicFramePr>
+            <a:graphic>
+              <a:graphicData uri="http://schemas.openxmlformats.org/drawingml/2006/picture">
+                <pic:pic>
+                  <pic:nvPicPr>
+                    <pic:cNvPr id="0" name="after-12-generated-preview-smoke.png"/>
+                    <pic:cNvPicPr/>
+                  </pic:nvPicPr>
+                  <pic:blipFill>
+                    <a:blip r:embed="rId20"/>
+                    <a:stretch>
+                      <a:fillRect/>
+                    </a:stretch>
+                  </pic:blipFill>
+                  <pic:spPr>
+                    <a:xfrm>
+                      <a:off x="0" y="0"/>
+                      <a:ext cx="5577840" cy="3563620"/>
+                    </a:xfrm>
+                    <a:prstGeom prst="rect"/>
+                  </pic:spPr>
+                </pic:pic>
+              </a:graphicData>
+            </a:graphic>
+          </wp:inline>
+        </w:drawing>
+      </w:r>
+    </w:p>
+    <w:p>
+      <w:pPr>
+        <w:jc w:val="center"/>
+      </w:pPr>
+      <w:r>
+        <w:rPr>
+          <w:color w:val="5A6560"/>
+          <w:sz w:val="16"/>
+        </w:rPr>
+        <w:t>Seeded/generated preview proof - screenshots/after/after-12-generated-preview-smoke.png</w:t>
+      </w:r>
+    </w:p>
+    <w:p>
+      <w:pPr>
+        <w:sectPr>
+          <w:pgSz w:w="12240" w:h="15840"/>
+          <w:pgMar w:top="936" w:right="1037" w:bottom="936" w:left="1037" w:header="720" w:footer="720" w:gutter="0"/>
+          <w:cols w:space="720"/>
+          <w:docGrid w:linePitch="360"/>
+        </w:sectPr>
+      </w:pPr>
+    </w:p>
+    <w:p>
+      <w:pPr>
+        <w:pStyle w:val="Heading1"/>
+      </w:pPr>
+      <w:r>
+        <w:t>Representative Before Screenshot Gallery</w:t>
+      </w:r>
+    </w:p>
+    <w:p>
+      <w:pPr>
+        <w:jc w:val="center"/>
+      </w:pPr>
+      <w:r>
+        <w:drawing>
+          <wp:inline xmlns:a="http://schemas.openxmlformats.org/drawingml/2006/main" xmlns:pic="http://schemas.openxmlformats.org/drawingml/2006/picture">
+            <wp:extent cx="5303520" cy="3462020"/>
+            <wp:docPr id="13" name="Picture 13"/>
+            <wp:cNvGraphicFramePr>
+              <a:graphicFrameLocks noChangeAspect="1"/>
+            </wp:cNvGraphicFramePr>
+            <a:graphic>
+              <a:graphicData uri="http://schemas.openxmlformats.org/drawingml/2006/picture">
+                <pic:pic>
+                  <pic:nvPicPr>
+                    <pic:cNvPr id="0" name="before-01-main-workspace-light.png"/>
+                    <pic:cNvPicPr/>
+                  </pic:nvPicPr>
+                  <pic:blipFill>
+                    <a:blip r:embed="rId21"/>
+                    <a:stretch>
+                      <a:fillRect/>
+                    </a:stretch>
+                  </pic:blipFill>
+                  <pic:spPr>
+                    <a:xfrm>
+                      <a:off x="0" y="0"/>
+                      <a:ext cx="5303520" cy="3462020"/>
+                    </a:xfrm>
+                    <a:prstGeom prst="rect"/>
+                  </pic:spPr>
+                </pic:pic>
+              </a:graphicData>
+            </a:graphic>
+          </wp:inline>
+        </w:drawing>
+      </w:r>
+    </w:p>
+    <w:p>
+      <w:pPr>
+        <w:jc w:val="center"/>
+      </w:pPr>
+      <w:r>
+        <w:rPr>
+          <w:color w:val="5A6560"/>
+          <w:sz w:val="16"/>
+        </w:rPr>
+        <w:t>Before main workspace light - screenshots/before/before-01-main-workspace-light.png</w:t>
+      </w:r>
+    </w:p>
+    <w:p>
+      <w:pPr>
+        <w:jc w:val="center"/>
+      </w:pPr>
+      <w:r>
+        <w:drawing>
+          <wp:inline xmlns:a="http://schemas.openxmlformats.org/drawingml/2006/main" xmlns:pic="http://schemas.openxmlformats.org/drawingml/2006/picture">
+            <wp:extent cx="5303520" cy="3462020"/>
+            <wp:docPr id="14" name="Picture 14"/>
+            <wp:cNvGraphicFramePr>
+              <a:graphicFrameLocks noChangeAspect="1"/>
+            </wp:cNvGraphicFramePr>
+            <a:graphic>
+              <a:graphicData uri="http://schemas.openxmlformats.org/drawingml/2006/picture">
+                <pic:pic>
+                  <pic:nvPicPr>
+                    <pic:cNvPr id="0" name="before-02-chat-generation-state-light.png"/>
+                    <pic:cNvPicPr/>
+                  </pic:nvPicPr>
+                  <pic:blipFill>
+                    <a:blip r:embed="rId22"/>
+                    <a:stretch>
+                      <a:fillRect/>
+                    </a:stretch>
+                  </pic:blipFill>
+                  <pic:spPr>
+                    <a:xfrm>
+                      <a:off x="0" y="0"/>
+                      <a:ext cx="5303520" cy="3462020"/>
+                    </a:xfrm>
+                    <a:prstGeom prst="rect"/>
+                  </pic:spPr>
+                </pic:pic>
+              </a:graphicData>
+            </a:graphic>
+          </wp:inline>
+        </w:drawing>
+      </w:r>
+    </w:p>
+    <w:p>
+      <w:pPr>
+        <w:jc w:val="center"/>
+      </w:pPr>
+      <w:r>
+        <w:rPr>
+          <w:color w:val="5A6560"/>
+          <w:sz w:val="16"/>
+        </w:rPr>
+        <w:t>Before chat/generation light - screenshots/before/before-02-chat-generation-state-light.png</w:t>
+      </w:r>
+    </w:p>
+    <w:p>
+      <w:pPr>
+        <w:jc w:val="center"/>
+      </w:pPr>
+      <w:r>
+        <w:drawing>
+          <wp:inline xmlns:a="http://schemas.openxmlformats.org/drawingml/2006/main" xmlns:pic="http://schemas.openxmlformats.org/drawingml/2006/picture">
+            <wp:extent cx="5303520" cy="3462020"/>
+            <wp:docPr id="15" name="Picture 15"/>
+            <wp:cNvGraphicFramePr>
+              <a:graphicFrameLocks noChangeAspect="1"/>
+            </wp:cNvGraphicFramePr>
+            <a:graphic>
+              <a:graphicData uri="http://schemas.openxmlformats.org/drawingml/2006/picture">
+                <pic:pic>
+                  <pic:nvPicPr>
+                    <pic:cNvPr id="0" name="before-03-empty-preview-light.png"/>
+                    <pic:cNvPicPr/>
+                  </pic:nvPicPr>
+                  <pic:blipFill>
+                    <a:blip r:embed="rId23"/>
+                    <a:stretch>
+                      <a:fillRect/>
+                    </a:stretch>
+                  </pic:blipFill>
+                  <pic:spPr>
+                    <a:xfrm>
+                      <a:off x="0" y="0"/>
+                      <a:ext cx="5303520" cy="3462020"/>
+                    </a:xfrm>
+                    <a:prstGeom prst="rect"/>
+                  </pic:spPr>
+                </pic:pic>
+              </a:graphicData>
+            </a:graphic>
+          </wp:inline>
+        </w:drawing>
+      </w:r>
+    </w:p>
+    <w:p>
+      <w:pPr>
+        <w:jc w:val="center"/>
+      </w:pPr>
+      <w:r>
+        <w:rPr>
+          <w:color w:val="5A6560"/>
+          <w:sz w:val="16"/>
+        </w:rPr>
+        <w:t>Before empty preview light - screenshots/before/before-03-empty-preview-light.png</w:t>
+      </w:r>
+    </w:p>
+    <w:p>
+      <w:pPr>
+        <w:jc w:val="center"/>
+      </w:pPr>
+      <w:r>
+        <w:drawing>
+          <wp:inline xmlns:a="http://schemas.openxmlformats.org/drawingml/2006/main" xmlns:pic="http://schemas.openxmlformats.org/drawingml/2006/picture">
+            <wp:extent cx="5303520" cy="3462020"/>
+            <wp:docPr id="16" name="Picture 16"/>
+            <wp:cNvGraphicFramePr>
+              <a:graphicFrameLocks noChangeAspect="1"/>
+            </wp:cNvGraphicFramePr>
+            <a:graphic>
+              <a:graphicData uri="http://schemas.openxmlformats.org/drawingml/2006/picture">
+                <pic:pic>
+                  <pic:nvPicPr>
+                    <pic:cNvPr id="0" name="before-04-editor-surface-light.png"/>
+                    <pic:cNvPicPr/>
+                  </pic:nvPicPr>
+                  <pic:blipFill>
+                    <a:blip r:embed="rId24"/>
+                    <a:stretch>
+                      <a:fillRect/>
+                    </a:stretch>
+                  </pic:blipFill>
+                  <pic:spPr>
+                    <a:xfrm>
+                      <a:off x="0" y="0"/>
+                      <a:ext cx="5303520" cy="3462020"/>
+                    </a:xfrm>
+                    <a:prstGeom prst="rect"/>
+                  </pic:spPr>
+                </pic:pic>
+              </a:graphicData>
+            </a:graphic>
+          </wp:inline>
+        </w:drawing>
+      </w:r>
+    </w:p>
+    <w:p>
+      <w:pPr>
+        <w:jc w:val="center"/>
+      </w:pPr>
+      <w:r>
+        <w:rPr>
+          <w:color w:val="5A6560"/>
+          <w:sz w:val="16"/>
+        </w:rPr>
+        <w:t>Before editor surface light - screenshots/before/before-04-editor-surface-light.png</w:t>
+      </w:r>
+    </w:p>
+    <w:p>
+      <w:pPr>
+        <w:jc w:val="center"/>
+      </w:pPr>
+      <w:r>
+        <w:drawing>
+          <wp:inline xmlns:a="http://schemas.openxmlformats.org/drawingml/2006/main" xmlns:pic="http://schemas.openxmlformats.org/drawingml/2006/picture">
+            <wp:extent cx="5303520" cy="3462020"/>
+            <wp:docPr id="17" name="Picture 17"/>
+            <wp:cNvGraphicFramePr>
+              <a:graphicFrameLocks noChangeAspect="1"/>
+            </wp:cNvGraphicFramePr>
+            <a:graphic>
+              <a:graphicData uri="http://schemas.openxmlformats.org/drawingml/2006/picture">
+                <pic:pic>
+                  <pic:nvPicPr>
+                    <pic:cNvPr id="0" name="before-05-provider-page-light.png"/>
+                    <pic:cNvPicPr/>
+                  </pic:nvPicPr>
+                  <pic:blipFill>
+                    <a:blip r:embed="rId25"/>
+                    <a:stretch>
+                      <a:fillRect/>
+                    </a:stretch>
+                  </pic:blipFill>
+                  <pic:spPr>
+                    <a:xfrm>
+                      <a:off x="0" y="0"/>
+                      <a:ext cx="5303520" cy="3462020"/>
+                    </a:xfrm>
+                    <a:prstGeom prst="rect"/>
+                  </pic:spPr>
+                </pic:pic>
+              </a:graphicData>
+            </a:graphic>
+          </wp:inline>
+        </w:drawing>
+      </w:r>
+    </w:p>
+    <w:p>
+      <w:pPr>
+        <w:jc w:val="center"/>
+      </w:pPr>
+      <w:r>
+        <w:rPr>
+          <w:color w:val="5A6560"/>
+          <w:sz w:val="16"/>
+        </w:rPr>
+        <w:t>Before provider page light - screenshots/before/before-05-provider-page-light.png</w:t>
+      </w:r>
+    </w:p>
+    <w:p>
+      <w:pPr>
+        <w:jc w:val="center"/>
+      </w:pPr>
+      <w:r>
+        <w:drawing>
+          <wp:inline xmlns:a="http://schemas.openxmlformats.org/drawingml/2006/main" xmlns:pic="http://schemas.openxmlformats.org/drawingml/2006/picture">
+            <wp:extent cx="5303520" cy="3462020"/>
+            <wp:docPr id="18" name="Picture 18"/>
+            <wp:cNvGraphicFramePr>
+              <a:graphicFrameLocks noChangeAspect="1"/>
+            </wp:cNvGraphicFramePr>
+            <a:graphic>
+              <a:graphicData uri="http://schemas.openxmlformats.org/drawingml/2006/picture">
+                <pic:pic>
+                  <pic:nvPicPr>
+                    <pic:cNvPr id="0" name="before-06-settings-page-light.png"/>
+                    <pic:cNvPicPr/>
+                  </pic:nvPicPr>
+                  <pic:blipFill>
+                    <a:blip r:embed="rId26"/>
+                    <a:stretch>
+                      <a:fillRect/>
+                    </a:stretch>
+                  </pic:blipFill>
+                  <pic:spPr>
+                    <a:xfrm>
+                      <a:off x="0" y="0"/>
+                      <a:ext cx="5303520" cy="3462020"/>
+                    </a:xfrm>
+                    <a:prstGeom prst="rect"/>
+                  </pic:spPr>
+                </pic:pic>
+              </a:graphicData>
+            </a:graphic>
+          </wp:inline>
+        </w:drawing>
+      </w:r>
+    </w:p>
+    <w:p>
+      <w:pPr>
+        <w:jc w:val="center"/>
+      </w:pPr>
+      <w:r>
+        <w:rPr>
+          <w:color w:val="5A6560"/>
+          <w:sz w:val="16"/>
+        </w:rPr>
+        <w:t>Before settings light - screenshots/before/before-06-settings-page-light.png</w:t>
+      </w:r>
+    </w:p>
+    <w:p>
+      <w:pPr>
+        <w:jc w:val="center"/>
+      </w:pPr>
+      <w:r>
+        <w:drawing>
+          <wp:inline xmlns:a="http://schemas.openxmlformats.org/drawingml/2006/main" xmlns:pic="http://schemas.openxmlformats.org/drawingml/2006/picture">
+            <wp:extent cx="5303520" cy="3462020"/>
+            <wp:docPr id="19" name="Picture 19"/>
+            <wp:cNvGraphicFramePr>
+              <a:graphicFrameLocks noChangeAspect="1"/>
+            </wp:cNvGraphicFramePr>
+            <a:graphic>
+              <a:graphicData uri="http://schemas.openxmlformats.org/drawingml/2006/picture">
+                <pic:pic>
+                  <pic:nvPicPr>
+                    <pic:cNvPr id="0" name="before-07-settings-page-dark.png"/>
+                    <pic:cNvPicPr/>
+                  </pic:nvPicPr>
+                  <pic:blipFill>
+                    <a:blip r:embed="rId27"/>
+                    <a:stretch>
+                      <a:fillRect/>
+                    </a:stretch>
+                  </pic:blipFill>
+                  <pic:spPr>
+                    <a:xfrm>
+                      <a:off x="0" y="0"/>
+                      <a:ext cx="5303520" cy="3462020"/>
+                    </a:xfrm>
+                    <a:prstGeom prst="rect"/>
+                  </pic:spPr>
+                </pic:pic>
+              </a:graphicData>
+            </a:graphic>
+          </wp:inline>
+        </w:drawing>
+      </w:r>
+    </w:p>
+    <w:p>
+      <w:pPr>
+        <w:jc w:val="center"/>
+      </w:pPr>
+      <w:r>
+        <w:rPr>
+          <w:color w:val="5A6560"/>
+          <w:sz w:val="16"/>
+        </w:rPr>
+        <w:t>Before settings dark - screenshots/before/before-07-settings-page-dark.png</w:t>
+      </w:r>
+    </w:p>
+    <w:p>
+      <w:pPr>
+        <w:jc w:val="center"/>
+      </w:pPr>
+      <w:r>
+        <w:drawing>
+          <wp:inline xmlns:a="http://schemas.openxmlformats.org/drawingml/2006/main" xmlns:pic="http://schemas.openxmlformats.org/drawingml/2006/picture">
+            <wp:extent cx="5303520" cy="3462020"/>
+            <wp:docPr id="20" name="Picture 20"/>
+            <wp:cNvGraphicFramePr>
+              <a:graphicFrameLocks noChangeAspect="1"/>
+            </wp:cNvGraphicFramePr>
+            <a:graphic>
+              <a:graphicData uri="http://schemas.openxmlformats.org/drawingml/2006/picture">
+                <pic:pic>
+                  <pic:nvPicPr>
+                    <pic:cNvPr id="0" name="before-08-empty-preview-dark.png"/>
+                    <pic:cNvPicPr/>
+                  </pic:nvPicPr>
+                  <pic:blipFill>
+                    <a:blip r:embed="rId28"/>
+                    <a:stretch>
+                      <a:fillRect/>
+                    </a:stretch>
+                  </pic:blipFill>
+                  <pic:spPr>
+                    <a:xfrm>
+                      <a:off x="0" y="0"/>
+                      <a:ext cx="5303520" cy="3462020"/>
+                    </a:xfrm>
+                    <a:prstGeom prst="rect"/>
+                  </pic:spPr>
+                </pic:pic>
+              </a:graphicData>
+            </a:graphic>
+          </wp:inline>
+        </w:drawing>
+      </w:r>
+    </w:p>
+    <w:p>
+      <w:pPr>
+        <w:jc w:val="center"/>
+      </w:pPr>
+      <w:r>
+        <w:rPr>
+          <w:color w:val="5A6560"/>
+          <w:sz w:val="16"/>
+        </w:rPr>
+        <w:t>Before empty preview dark - screenshots/before/before-08-empty-preview-dark.png</w:t>
+      </w:r>
+    </w:p>
+    <w:p>
+      <w:pPr>
+        <w:jc w:val="center"/>
+      </w:pPr>
+      <w:r>
+        <w:drawing>
+          <wp:inline xmlns:a="http://schemas.openxmlformats.org/drawingml/2006/main" xmlns:pic="http://schemas.openxmlformats.org/drawingml/2006/picture">
+            <wp:extent cx="4655127" cy="3574473"/>
+            <wp:docPr id="21" name="Picture 21"/>
+            <wp:cNvGraphicFramePr>
+              <a:graphicFrameLocks noChangeAspect="1"/>
+            </wp:cNvGraphicFramePr>
+            <a:graphic>
+              <a:graphicData uri="http://schemas.openxmlformats.org/drawingml/2006/picture">
+                <pic:pic>
+                  <pic:nvPicPr>
+                    <pic:cNvPr id="0" name="before-09-narrow-chat-light.png"/>
+                    <pic:cNvPicPr/>
+                  </pic:nvPicPr>
+                  <pic:blipFill>
+                    <a:blip r:embed="rId29"/>
+                    <a:stretch>
+                      <a:fillRect/>
+                    </a:stretch>
+                  </pic:blipFill>
+                  <pic:spPr>
+                    <a:xfrm>
+                      <a:off x="0" y="0"/>
+                      <a:ext cx="4655127" cy="3574473"/>
+                    </a:xfrm>
+                    <a:prstGeom prst="rect"/>
+                  </pic:spPr>
+                </pic:pic>
+              </a:graphicData>
+            </a:graphic>
+          </wp:inline>
+        </w:drawing>
+      </w:r>
+    </w:p>
+    <w:p>
+      <w:pPr>
+        <w:jc w:val="center"/>
+      </w:pPr>
+      <w:r>
+        <w:rPr>
+          <w:color w:val="5A6560"/>
+          <w:sz w:val="16"/>
+        </w:rPr>
+        <w:t>Before narrow chat light - screenshots/before/before-09-narrow-chat-light.png</w:t>
+      </w:r>
+    </w:p>
+    <w:p>
+      <w:pPr>
+        <w:jc w:val="center"/>
+      </w:pPr>
+      <w:r>
+        <w:drawing>
+          <wp:inline xmlns:a="http://schemas.openxmlformats.org/drawingml/2006/main" xmlns:pic="http://schemas.openxmlformats.org/drawingml/2006/picture">
+            <wp:extent cx="4655127" cy="3574473"/>
+            <wp:docPr id="22" name="Picture 22"/>
+            <wp:cNvGraphicFramePr>
+              <a:graphicFrameLocks noChangeAspect="1"/>
+            </wp:cNvGraphicFramePr>
+            <a:graphic>
+              <a:graphicData uri="http://schemas.openxmlformats.org/drawingml/2006/picture">
+                <pic:pic>
+                  <pic:nvPicPr>
+                    <pic:cNvPr id="0" name="before-10-narrow-editor-dark.png"/>
+                    <pic:cNvPicPr/>
+                  </pic:nvPicPr>
+                  <pic:blipFill>
+                    <a:blip r:embed="rId30"/>
+                    <a:stretch>
+                      <a:fillRect/>
+                    </a:stretch>
+                  </pic:blipFill>
+                  <pic:spPr>
+                    <a:xfrm>
+                      <a:off x="0" y="0"/>
+                      <a:ext cx="4655127" cy="3574473"/>
+                    </a:xfrm>
+                    <a:prstGeom prst="rect"/>
+                  </pic:spPr>
+                </pic:pic>
+              </a:graphicData>
+            </a:graphic>
+          </wp:inline>
+        </w:drawing>
+      </w:r>
+    </w:p>
+    <w:p>
+      <w:pPr>
+        <w:jc w:val="center"/>
+      </w:pPr>
+      <w:r>
+        <w:rPr>
+          <w:color w:val="5A6560"/>
+          <w:sz w:val="16"/>
+        </w:rPr>
+        <w:t>Before narrow editor dark - screenshots/before/before-10-narrow-editor-dark.png</w:t>
+      </w:r>
+    </w:p>
     <w:p>
       <w:pPr>
         <w:pStyle w:val="Heading1"/>
@@ -1668,7 +2213,7 @@
         <w:pStyle w:val="ListBullet"/>
       </w:pPr>
       <w:r>
-        <w:t>Desktop light/dark editor shell presents the AI rail, preview, and inspector without generated colors affecting app chrome.</w:t>
+        <w:t>Typography and control labels now use a consistent readable scale across chrome, chat, provider, and settings surfaces.</w:t>
       </w:r>
     </w:p>
     <w:p>
@@ -1676,7 +2221,7 @@
         <w:pStyle w:val="ListBullet"/>
       </w:pPr>
       <w:r>
-        <w:t>Empty preview state remains useful and does not look like a broken blank panel.</w:t>
+        <w:t>Empty previews provide useful guidance instead of looking broken or blank.</w:t>
       </w:r>
     </w:p>
     <w:p>
@@ -1684,7 +2229,7 @@
         <w:pStyle w:val="ListBullet"/>
       </w:pPr>
       <w:r>
-        <w:t>Generated preview proof shows selected ContextBody, visible selection outline, active layer state, and disabled operation controls.</w:t>
+        <w:t>Generated preview proof shows selected ContextBody, selection outline placeholder, layer active state, and state buttons.</w:t>
       </w:r>
     </w:p>
     <w:p>
@@ -1692,7 +2237,7 @@
         <w:pStyle w:val="ListBullet"/>
       </w:pPr>
       <w:r>
-        <w:t>Narrow layout stacks the shell and wraps toolbar controls without overlapping primary content in viewport capture.</w:t>
+        <w:t>Final Browser captures show no primary text/control overlap across refreshed Phase 1 surfaces.</w:t>
       </w:r>
     </w:p>
     <w:p>
@@ -1708,7 +2253,7 @@
         <w:pStyle w:val="ListBullet"/>
       </w:pPr>
       <w:r>
-        <w:t>Selection is visual/contextual only. It does not yet produce validated document operations or operation history; that belongs in Phase 2.</w:t>
+        <w:t>Selection remains visual/contextual only; real preview hit-testing and shared selection state belong to Phase 2.</w:t>
       </w:r>
     </w:p>
     <w:p>
@@ -1716,7 +2261,7 @@
         <w:pStyle w:val="ListBullet"/>
       </w:pPr>
       <w:r>
-        <w:t>Browser-only generation still cannot create a generated document because real generation requires the Tauri desktop runtime/provider path.</w:t>
+        <w:t>Apply/reject controls are intentionally disabled placeholders; real operation patches and operation history are later-phase work.</w:t>
       </w:r>
     </w:p>
     <w:p>
@@ -1724,7 +2269,7 @@
         <w:pStyle w:val="ListBullet"/>
       </w:pPr>
       <w:r>
-        <w:t>Some unrelated dirty docs/backend files from the initial worktree remain intentionally preserved and uncommitted.</w:t>
+        <w:t>Browser-only generation stops at the expected desktop-runtime/provider fallback; real generation requires Tauri desktop runtime/provider path.</w:t>
       </w:r>
     </w:p>
     <w:p>
@@ -1732,7 +2277,15 @@
         <w:pStyle w:val="ListBullet"/>
       </w:pPr>
       <w:r>
-        <w:t>The existing App.tsx remains large; deeper Phase 2 work should consider extracting shell, rail, preview, and inspector components before adding real operation state.</w:t>
+        <w:t>Seeded generated preview proof comes from the smoke test rather than browser-only generation.</w:t>
+      </w:r>
+    </w:p>
+    <w:p>
+      <w:pPr>
+        <w:pStyle w:val="ListBullet"/>
+      </w:pPr>
+      <w:r>
+        <w:t>Unrelated dirty docs/Tauri files remain preserved outside this Phase 1 report refresh.</w:t>
       </w:r>
     </w:p>
     <w:p>
@@ -1740,52 +2293,17 @@
         <w:pStyle w:val="Heading1"/>
       </w:pPr>
       <w:r>
-        <w:t>Next Phase Recommendation</w:t>
-      </w:r>
-    </w:p>
-    <w:p>
-      <w:pPr>
-        <w:pStyle w:val="ListBullet"/>
-      </w:pPr>
-      <w:r>
-        <w:t>Phase 2 should add a real scene selection model shared by preview, layers, inspector, and AI context.</w:t>
-      </w:r>
-    </w:p>
-    <w:p>
-      <w:pPr>
-        <w:pStyle w:val="ListBullet"/>
-      </w:pPr>
-      <w:r>
-        <w:t>Add inspectable operation preview data before enabling Apply/Reject.</w:t>
-      </w:r>
-    </w:p>
-    <w:p>
-      <w:pPr>
-        <w:pStyle w:val="ListBullet"/>
-      </w:pPr>
-      <w:r>
-        <w:t>Keep dynamic generation planning and CLI work out of Phase 2 unless the phase boundary is explicitly reopened.</w:t>
-      </w:r>
-    </w:p>
-    <w:p>
-      <w:pPr>
-        <w:pStyle w:val="Heading1"/>
-      </w:pPr>
-      <w:r>
-        <w:t>Render Export Note</w:t>
+        <w:t>Phase Boundary</w:t>
       </w:r>
     </w:p>
     <w:p>
       <w:r>
-        <w:rPr>
-          <w:sz w:val="22"/>
-        </w:rPr>
-        <w:t>DOCX render export was blocked locally: LibreOffice/soffice was unavailable, and Microsoft Word COM PDF export hung twice before producing a PDF. The DOCX package passed structural inspection and embeds the screenshot evidence; the Browser screenshot gallery under screenshots/ is the visual proof artifact for Phase 1.</w:t>
+        <w:t>Phase 2 has not started. This closure pass refreshed Phase 1 evidence, report files, screenshots, and document deliverables only.</w:t>
       </w:r>
     </w:p>
     <w:sectPr>
       <w:pgSz w:w="12240" w:h="15840"/>
-      <w:pgMar w:top="1440" w:right="1440" w:bottom="1440" w:left="1440" w:header="720" w:footer="720" w:gutter="0"/>
+      <w:pgMar w:top="936" w:right="1037" w:bottom="936" w:left="1037" w:header="720" w:footer="720" w:gutter="0"/>
       <w:cols w:space="720"/>
       <w:docGrid w:linePitch="360"/>
     </w:sectPr>
@@ -2156,12 +2674,9 @@
     <w:name w:val="Normal"/>
     <w:qFormat/>
     <w:rsid w:val="00FC693F"/>
-    <w:pPr>
-      <w:spacing w:after="120" w:line="264" w:lineRule="auto"/>
-    </w:pPr>
     <w:rPr>
-      <w:rFonts w:ascii="Calibri" w:hAnsi="Calibri"/>
-      <w:sz w:val="22"/>
+      <w:rFonts w:ascii="Arial" w:hAnsi="Arial"/>
+      <w:sz w:val="20"/>
     </w:rPr>
   </w:style>
   <w:style w:type="paragraph" w:styleId="Header">
@@ -2219,14 +2734,14 @@
     <w:pPr>
       <w:keepNext/>
       <w:keepLines/>
-      <w:spacing w:before="320" w:after="160"/>
+      <w:spacing w:before="480" w:after="0"/>
       <w:outlineLvl w:val="0"/>
     </w:pPr>
     <w:rPr>
-      <w:rFonts w:asciiTheme="majorHAnsi" w:eastAsiaTheme="majorEastAsia" w:hAnsiTheme="majorHAnsi" w:cstheme="majorBidi" w:ascii="Calibri" w:hAnsi="Calibri"/>
+      <w:rFonts w:asciiTheme="majorHAnsi" w:eastAsiaTheme="majorEastAsia" w:hAnsiTheme="majorHAnsi" w:cstheme="majorBidi" w:ascii="Arial" w:hAnsi="Arial"/>
       <w:b/>
       <w:bCs/>
-      <w:color w:val="2E74B5"/>
+      <w:color w:val="204A40"/>
       <w:sz w:val="32"/>
       <w:szCs w:val="28"/>
     </w:rPr>
@@ -2243,14 +2758,14 @@
     <w:pPr>
       <w:keepNext/>
       <w:keepLines/>
-      <w:spacing w:before="240" w:after="120"/>
+      <w:spacing w:before="200" w:after="0"/>
       <w:outlineLvl w:val="1"/>
     </w:pPr>
     <w:rPr>
-      <w:rFonts w:asciiTheme="majorHAnsi" w:eastAsiaTheme="majorEastAsia" w:hAnsiTheme="majorHAnsi" w:cstheme="majorBidi" w:ascii="Calibri" w:hAnsi="Calibri"/>
+      <w:rFonts w:asciiTheme="majorHAnsi" w:eastAsiaTheme="majorEastAsia" w:hAnsiTheme="majorHAnsi" w:cstheme="majorBidi" w:ascii="Arial" w:hAnsi="Arial"/>
       <w:b/>
       <w:bCs/>
-      <w:color w:val="2E74B5"/>
+      <w:color w:val="204A40"/>
       <w:sz w:val="26"/>
       <w:szCs w:val="26"/>
     </w:rPr>
@@ -2267,15 +2782,15 @@
     <w:pPr>
       <w:keepNext/>
       <w:keepLines/>
-      <w:spacing w:before="160" w:after="80"/>
+      <w:spacing w:before="200" w:after="0"/>
       <w:outlineLvl w:val="2"/>
     </w:pPr>
     <w:rPr>
-      <w:rFonts w:asciiTheme="majorHAnsi" w:eastAsiaTheme="majorEastAsia" w:hAnsiTheme="majorHAnsi" w:cstheme="majorBidi" w:ascii="Calibri" w:hAnsi="Calibri"/>
+      <w:rFonts w:asciiTheme="majorHAnsi" w:eastAsiaTheme="majorEastAsia" w:hAnsiTheme="majorHAnsi" w:cstheme="majorBidi" w:ascii="Arial" w:hAnsi="Arial"/>
       <w:b/>
       <w:bCs/>
-      <w:color w:val="1F4D78"/>
-      <w:sz w:val="24"/>
+      <w:color w:val="204A40"/>
+      <w:sz w:val="22"/>
     </w:rPr>
   </w:style>
   <w:style w:type="paragraph" w:styleId="Heading4">

</xml_diff>